<commit_message>
fix: drop the empty paragraph after a table
It was padding every table with a blank line. It also kept two adjacent tables
from being merged into one by Word, but a caption now always sits between them
and does that job.

Co-Authored-By: Claude Opus 4.8 <noreply@anthropic.com>
</commit_message>
<xml_diff>
--- a/examples/example.docx
+++ b/examples/example.docx
@@ -479,7 +479,6 @@
         </w:tc>
       </w:tr>
     </w:tbl>
-    <w:p/>
     <w:p>
       <w:pPr>
         <w:keepNext/>
@@ -648,7 +647,6 @@
         </w:tc>
       </w:tr>
     </w:tbl>
-    <w:p/>
     <w:p>
       <w:pPr>
         <w:keepNext/>
@@ -831,7 +829,20 @@
         </w:tc>
       </w:tr>
     </w:tbl>
-    <w:p/>
+    <w:p>
+      <w:pPr>
+        <w:keepNext/>
+        <w:spacing w:line="240" w:lineRule="auto" w:after="120"/>
+        <w:ind w:firstLine="0"/>
+        <w:jc w:val="left"/>
+      </w:pPr>
+      <w:r>
+        <w:rPr>
+          <w:sz w:val="28"/>
+        </w:rPr>
+        <w:t>Таблица А.4 – Таблица сразу за другой таблицей</w:t>
+      </w:r>
+    </w:p>
     <w:tbl>
       <w:tblPr>
         <w:tblStyle w:val="TableGrid"/>
@@ -1051,7 +1062,6 @@
         </w:tc>
       </w:tr>
     </w:tbl>
-    <w:p/>
     <w:p>
       <w:pPr>
         <w:keepNext/>
@@ -7779,7 +7789,6 @@
         </w:tc>
       </w:tr>
     </w:tbl>
-    <w:p/>
     <w:sectPr>
       <w:pgSz w:w="12240" w:h="15840"/>
       <w:pgMar w:top="1134" w:right="850" w:bottom="1134" w:left="1701" w:header="720" w:footer="720" w:gutter="0"/>

</xml_diff>

<commit_message>
refactor: change heads style
</commit_message>
<xml_diff>
--- a/examples/example.docx
+++ b/examples/example.docx
@@ -8229,8 +8229,8 @@
       <w:keepNext/>
       <w:keepLines/>
       <w:spacing w:before="0" w:after="0" w:line="360" w:lineRule="auto"/>
-      <w:ind w:firstLine="0"/>
-      <w:jc w:val="center"/>
+      <w:ind w:firstLine="709"/>
+      <w:jc w:val="both"/>
       <w:outlineLvl w:val="0"/>
     </w:pPr>
     <w:rPr>
@@ -8238,7 +8238,7 @@
       <w:b/>
       <w:bCs/>
       <w:i w:val="0"/>
-      <w:caps/>
+      <w:caps w:val="0"/>
       <w:color w:val="000000"/>
       <w:sz w:val="28"/>
       <w:szCs w:val="28"/>
@@ -8258,7 +8258,7 @@
       <w:keepLines/>
       <w:spacing w:before="0" w:after="0" w:line="360" w:lineRule="auto"/>
       <w:ind w:firstLine="709"/>
-      <w:jc w:val="left"/>
+      <w:jc w:val="both"/>
       <w:outlineLvl w:val="1"/>
     </w:pPr>
     <w:rPr>
@@ -8286,12 +8286,12 @@
       <w:keepLines/>
       <w:spacing w:before="0" w:after="0" w:line="360" w:lineRule="auto"/>
       <w:ind w:firstLine="709"/>
-      <w:jc w:val="left"/>
+      <w:jc w:val="both"/>
       <w:outlineLvl w:val="2"/>
     </w:pPr>
     <w:rPr>
       <w:rFonts w:ascii="Times New Roman" w:hAnsi="Times New Roman"/>
-      <w:b/>
+      <w:b w:val="0"/>
       <w:bCs/>
       <w:i w:val="0"/>
       <w:caps w:val="0"/>
@@ -8314,12 +8314,12 @@
       <w:keepLines/>
       <w:spacing w:before="0" w:after="0" w:line="360" w:lineRule="auto"/>
       <w:ind w:firstLine="709"/>
-      <w:jc w:val="left"/>
+      <w:jc w:val="both"/>
       <w:outlineLvl w:val="3"/>
     </w:pPr>
     <w:rPr>
       <w:rFonts w:ascii="Times New Roman" w:hAnsi="Times New Roman"/>
-      <w:b/>
+      <w:b w:val="0"/>
       <w:bCs/>
       <w:i w:val="0"/>
       <w:iCs/>

</xml_diff>

<commit_message>
feat: add title level 0
</commit_message>
<xml_diff>
--- a/examples/example.docx
+++ b/examples/example.docx
@@ -7,7 +7,7 @@
         <w:pStyle w:val="Heading1"/>
       </w:pPr>
       <w:r>
-        <w:t>А.1 Заголовок первого уровня (Heading 1, по центру, UPPER)</w:t>
+        <w:t>Основная часть (уровень 0, Heading 1, по центру, UPPER, без номера)</w:t>
       </w:r>
     </w:p>
     <w:p>
@@ -15,7 +15,7 @@
         <w:pStyle w:val="Heading2"/>
       </w:pPr>
       <w:r>
-        <w:t>А.1.1 Заголовок второго уровня (Heading 2, слева, с номером)</w:t>
+        <w:t>А.1 Заголовок первого уровня (уровень 1, Heading 2, с номером)</w:t>
       </w:r>
     </w:p>
     <w:p>
@@ -23,7 +23,7 @@
         <w:pStyle w:val="Heading3"/>
       </w:pPr>
       <w:r>
-        <w:t>А.1.1.1 Заголовок третьего уровня (Heading 3, слева, с номером)</w:t>
+        <w:t>А.1.1 Заголовок второго уровня (уровень 2, Heading 3, с номером)</w:t>
       </w:r>
     </w:p>
     <w:p>
@@ -31,7 +31,15 @@
         <w:pStyle w:val="Heading4"/>
       </w:pPr>
       <w:r>
-        <w:t>А.1.1.1.1 Заголовок четвертого уровня (Heading 4, слева, с номером)</w:t>
+        <w:t>А.1.1.1 Заголовок третьего уровня (уровень 3, Heading 4, с номером)</w:t>
+      </w:r>
+    </w:p>
+    <w:p>
+      <w:pPr>
+        <w:pStyle w:val="Heading5"/>
+      </w:pPr>
+      <w:r>
+        <w:t>А.1.1.1.1 Заголовок четвертого уровня (уровень 4, Heading 5, с номером)</w:t>
       </w:r>
     </w:p>
     <w:p>
@@ -8229,8 +8237,8 @@
       <w:keepNext/>
       <w:keepLines/>
       <w:spacing w:before="0" w:after="0" w:line="360" w:lineRule="auto"/>
-      <w:ind w:firstLine="709"/>
-      <w:jc w:val="both"/>
+      <w:ind w:firstLine="0"/>
+      <w:jc w:val="center"/>
       <w:outlineLvl w:val="0"/>
     </w:pPr>
     <w:rPr>
@@ -8238,7 +8246,7 @@
       <w:b/>
       <w:bCs/>
       <w:i w:val="0"/>
-      <w:caps w:val="0"/>
+      <w:caps/>
       <w:color w:val="000000"/>
       <w:sz w:val="28"/>
       <w:szCs w:val="28"/>
@@ -8291,7 +8299,7 @@
     </w:pPr>
     <w:rPr>
       <w:rFonts w:ascii="Times New Roman" w:hAnsi="Times New Roman"/>
-      <w:b w:val="0"/>
+      <w:b/>
       <w:bCs/>
       <w:i w:val="0"/>
       <w:caps w:val="0"/>
@@ -8341,12 +8349,18 @@
     <w:pPr>
       <w:keepNext/>
       <w:keepLines/>
-      <w:spacing w:before="200" w:after="0"/>
+      <w:spacing w:before="0" w:after="0" w:line="360" w:lineRule="auto"/>
+      <w:ind w:firstLine="709"/>
+      <w:jc w:val="both"/>
       <w:outlineLvl w:val="4"/>
     </w:pPr>
     <w:rPr>
-      <w:rFonts w:asciiTheme="majorHAnsi" w:eastAsiaTheme="majorEastAsia" w:hAnsiTheme="majorHAnsi" w:cstheme="majorBidi"/>
-      <w:color w:val="243F60" w:themeColor="accent1" w:themeShade="7F"/>
+      <w:rFonts w:ascii="Times New Roman" w:hAnsi="Times New Roman"/>
+      <w:b w:val="0"/>
+      <w:i w:val="0"/>
+      <w:caps w:val="0"/>
+      <w:color w:val="000000"/>
+      <w:sz w:val="28"/>
     </w:rPr>
   </w:style>
   <w:style w:type="paragraph" w:styleId="Heading6">

</xml_diff>

<commit_message>
refactor: update README.md and example
</commit_message>
<xml_diff>
--- a/examples/example.docx
+++ b/examples/example.docx
@@ -47,30 +47,56 @@
         <w:t xml:space="preserve">Обычный абзац: Times New Roman 14pt, выравнивание по ширине, межстрочный интервал 1,5, красная строка 1,25 см. Длинный текст нужен, чтобы проверить выравнивание по ширине на нескольких строках — вот ещё немного слов для этого. </w:t>
       </w:r>
     </w:p>
-    <w:p>
-      <w:r/>
-    </w:p>
+    <w:p/>
     <w:p>
       <w:r>
-        <w:t xml:space="preserve">Абзац с </w:t>
+        <w:t xml:space="preserve">Инлайн-разметка: </w:t>
       </w:r>
       <w:r>
         <w:rPr>
           <w:b/>
         </w:rPr>
-        <w:t>жирным текстом</w:t>
+        <w:t>жирный</w:t>
       </w:r>
       <w:r>
-        <w:t xml:space="preserve"> внутри обычного предложения — проверка парсера </w:t>
+        <w:t xml:space="preserve">, </w:t>
+      </w:r>
+      <w:r>
+        <w:rPr>
+          <w:i/>
+        </w:rPr>
+        <w:t>курсив</w:t>
+      </w:r>
+      <w:r>
+        <w:t xml:space="preserve">, </w:t>
+      </w:r>
+      <w:r>
+        <w:rPr>
+          <w:i/>
+        </w:rPr>
+        <w:t>тоже курсив</w:t>
+      </w:r>
+      <w:r>
+        <w:t xml:space="preserve">, </w:t>
       </w:r>
       <w:r>
         <w:rPr>
           <w:b/>
+          <w:i/>
         </w:rPr>
-        <w:t>bold</w:t>
+        <w:t>жирный курсив</w:t>
       </w:r>
       <w:r>
-        <w:t>-разметки.</w:t>
+        <w:t xml:space="preserve">, </w:t>
+      </w:r>
+      <w:r>
+        <w:rPr>
+          <w:u w:val="single"/>
+        </w:rPr>
+        <w:t>подчёркнутый</w:t>
+      </w:r>
+      <w:r>
+        <w:t>. Неразрывный пробел склеивает «рис. 1» и «10 кг», чтобы их не разорвал перенос строки.</w:t>
       </w:r>
     </w:p>
     <w:p>
@@ -129,7 +155,20 @@
         <w:rPr>
           <w:sz w:val="28"/>
         </w:rPr>
-        <w:t>Рисунок А.1 – Пример подписи к рисунку. Пример подписи к рисунку. Пример подписи к рисунку. Пример подписи к рисунку. Пример подписи к рисунку</w:t>
+        <w:t xml:space="preserve">Рисунок А.1 – Пример подписи к рисунку с </w:t>
+      </w:r>
+      <w:r>
+        <w:rPr>
+          <w:i/>
+          <w:sz w:val="28"/>
+        </w:rPr>
+        <w:t>курсивом</w:t>
+      </w:r>
+      <w:r>
+        <w:rPr>
+          <w:sz w:val="28"/>
+        </w:rPr>
+        <w:t>. Пример подписи к рисунку. Пример подписи к рисунку. Пример подписи к рисунку. Пример подписи к рисунку</w:t>
       </w:r>
     </w:p>
     <w:p>
@@ -499,7 +538,34 @@
         <w:rPr>
           <w:sz w:val="28"/>
         </w:rPr>
-        <w:t>Таблица А.2 – Без «№ п/п» и без строки номеров столбцов</w:t>
+        <w:t xml:space="preserve">Таблица А.2 – Подпись с </w:t>
+      </w:r>
+      <w:r>
+        <w:rPr>
+          <w:b/>
+          <w:sz w:val="28"/>
+        </w:rPr>
+        <w:t>жирным</w:t>
+      </w:r>
+      <w:r>
+        <w:rPr>
+          <w:sz w:val="28"/>
+        </w:rPr>
+        <w:t xml:space="preserve"> и </w:t>
+      </w:r>
+      <w:r>
+        <w:rPr>
+          <w:b/>
+          <w:i/>
+          <w:sz w:val="28"/>
+        </w:rPr>
+        <w:t>жирным курсивом</w:t>
+      </w:r>
+      <w:r>
+        <w:rPr>
+          <w:sz w:val="28"/>
+        </w:rPr>
+        <w:t xml:space="preserve"> (без «№ п/п» и номеров столбцов)</w:t>
       </w:r>
     </w:p>
     <w:tbl>

</xml_diff>

<commit_message>
feat: add source code and base classes
</commit_message>
<xml_diff>
--- a/examples/example.docx
+++ b/examples/example.docx
@@ -5,76 +5,220 @@
     <w:p>
       <w:pPr>
         <w:pStyle w:val="Heading1"/>
+        <w:spacing w:line="360" w:lineRule="auto" w:before="0" w:after="0"/>
+        <w:ind w:firstLine="0"/>
+        <w:jc w:val="center"/>
       </w:pPr>
       <w:r>
+        <w:rPr>
+          <w:rFonts w:ascii="Times New Roman" w:hAnsi="Times New Roman"/>
+          <w:b/>
+          <w:i w:val="0"/>
+          <w:caps/>
+          <w:color w:val="000000"/>
+          <w:sz w:val="28"/>
+        </w:rPr>
         <w:t>Основная часть (уровень 0, Heading 1, по центру, UPPER, без номера)</w:t>
       </w:r>
     </w:p>
     <w:p>
       <w:pPr>
         <w:pStyle w:val="Heading2"/>
+        <w:spacing w:line="360" w:lineRule="auto" w:before="0" w:after="0"/>
+        <w:ind w:firstLine="709"/>
+        <w:jc w:val="both"/>
       </w:pPr>
       <w:r>
+        <w:rPr>
+          <w:rFonts w:ascii="Times New Roman" w:hAnsi="Times New Roman"/>
+          <w:b/>
+          <w:i w:val="0"/>
+          <w:caps w:val="0"/>
+          <w:color w:val="000000"/>
+          <w:sz w:val="28"/>
+        </w:rPr>
         <w:t>А.1 Заголовок первого уровня (уровень 1, Heading 2, с номером)</w:t>
       </w:r>
     </w:p>
     <w:p>
       <w:pPr>
         <w:pStyle w:val="Heading3"/>
+        <w:spacing w:line="360" w:lineRule="auto" w:before="0" w:after="0"/>
+        <w:ind w:firstLine="709"/>
+        <w:jc w:val="both"/>
       </w:pPr>
       <w:r>
+        <w:rPr>
+          <w:rFonts w:ascii="Times New Roman" w:hAnsi="Times New Roman"/>
+          <w:b/>
+          <w:i w:val="0"/>
+          <w:caps w:val="0"/>
+          <w:color w:val="000000"/>
+          <w:sz w:val="28"/>
+        </w:rPr>
         <w:t>А.1.1 Заголовок второго уровня (уровень 2, Heading 3, с номером)</w:t>
       </w:r>
     </w:p>
     <w:p>
       <w:pPr>
         <w:pStyle w:val="Heading4"/>
+        <w:spacing w:line="360" w:lineRule="auto" w:before="0" w:after="0"/>
+        <w:ind w:firstLine="709"/>
+        <w:jc w:val="both"/>
       </w:pPr>
       <w:r>
+        <w:rPr>
+          <w:rFonts w:ascii="Times New Roman" w:hAnsi="Times New Roman"/>
+          <w:b w:val="0"/>
+          <w:i w:val="0"/>
+          <w:caps w:val="0"/>
+          <w:color w:val="000000"/>
+          <w:sz w:val="28"/>
+        </w:rPr>
         <w:t>А.1.1.1 Заголовок третьего уровня (уровень 3, Heading 4, с номером)</w:t>
       </w:r>
     </w:p>
     <w:p>
       <w:pPr>
         <w:pStyle w:val="Heading5"/>
+        <w:spacing w:line="360" w:lineRule="auto" w:before="0" w:after="0"/>
+        <w:ind w:firstLine="709"/>
+        <w:jc w:val="both"/>
       </w:pPr>
       <w:r>
+        <w:rPr>
+          <w:rFonts w:ascii="Times New Roman" w:hAnsi="Times New Roman"/>
+          <w:b w:val="0"/>
+          <w:i w:val="0"/>
+          <w:caps w:val="0"/>
+          <w:color w:val="000000"/>
+          <w:sz w:val="28"/>
+        </w:rPr>
         <w:t>А.1.1.1.1 Заголовок четвертого уровня (уровень 4, Heading 5, с номером)</w:t>
       </w:r>
     </w:p>
     <w:p>
+      <w:pPr>
+        <w:spacing w:line="360" w:lineRule="auto" w:before="0" w:after="0"/>
+        <w:ind w:firstLine="709"/>
+        <w:jc w:val="both"/>
+      </w:pPr>
       <w:r>
+        <w:rPr>
+          <w:rFonts w:ascii="Times New Roman" w:hAnsi="Times New Roman"/>
+          <w:sz w:val="28"/>
+        </w:rPr>
         <w:t xml:space="preserve">Обычный абзац: Times New Roman 14pt, выравнивание по ширине, межстрочный интервал 1,5, красная строка 1,25 см. Длинный текст нужен, чтобы проверить выравнивание по ширине на нескольких строках — вот ещё немного слов для этого. </w:t>
       </w:r>
     </w:p>
     <w:p>
-      <w:r/>
+      <w:pPr>
+        <w:spacing w:line="360" w:lineRule="auto" w:before="0" w:after="0"/>
+        <w:ind w:firstLine="709"/>
+        <w:jc w:val="both"/>
+      </w:pPr>
     </w:p>
     <w:p>
+      <w:pPr>
+        <w:spacing w:line="360" w:lineRule="auto" w:before="0" w:after="0"/>
+        <w:ind w:firstLine="709"/>
+        <w:jc w:val="both"/>
+      </w:pPr>
       <w:r>
-        <w:t xml:space="preserve">Абзац с </w:t>
+        <w:rPr>
+          <w:rFonts w:ascii="Times New Roman" w:hAnsi="Times New Roman"/>
+          <w:sz w:val="28"/>
+        </w:rPr>
+        <w:t xml:space="preserve">Инлайн-разметка: </w:t>
       </w:r>
       <w:r>
         <w:rPr>
+          <w:rFonts w:ascii="Times New Roman" w:hAnsi="Times New Roman"/>
           <w:b/>
+          <w:sz w:val="28"/>
         </w:rPr>
-        <w:t>жирным текстом</w:t>
-      </w:r>
-      <w:r>
-        <w:t xml:space="preserve"> внутри обычного предложения — проверка парсера </w:t>
+        <w:t>жирный</w:t>
       </w:r>
       <w:r>
         <w:rPr>
-          <w:b/>
+          <w:rFonts w:ascii="Times New Roman" w:hAnsi="Times New Roman"/>
+          <w:sz w:val="28"/>
         </w:rPr>
-        <w:t>bold</w:t>
+        <w:t xml:space="preserve">, </w:t>
       </w:r>
       <w:r>
-        <w:t>-разметки.</w:t>
+        <w:rPr>
+          <w:rFonts w:ascii="Times New Roman" w:hAnsi="Times New Roman"/>
+          <w:i/>
+          <w:sz w:val="28"/>
+        </w:rPr>
+        <w:t>курсив</w:t>
+      </w:r>
+      <w:r>
+        <w:rPr>
+          <w:rFonts w:ascii="Times New Roman" w:hAnsi="Times New Roman"/>
+          <w:sz w:val="28"/>
+        </w:rPr>
+        <w:t xml:space="preserve">, </w:t>
+      </w:r>
+      <w:r>
+        <w:rPr>
+          <w:rFonts w:ascii="Times New Roman" w:hAnsi="Times New Roman"/>
+          <w:i/>
+          <w:sz w:val="28"/>
+        </w:rPr>
+        <w:t>тоже курсив</w:t>
+      </w:r>
+      <w:r>
+        <w:rPr>
+          <w:rFonts w:ascii="Times New Roman" w:hAnsi="Times New Roman"/>
+          <w:sz w:val="28"/>
+        </w:rPr>
+        <w:t xml:space="preserve">, </w:t>
+      </w:r>
+      <w:r>
+        <w:rPr>
+          <w:rFonts w:ascii="Times New Roman" w:hAnsi="Times New Roman"/>
+          <w:b/>
+          <w:i/>
+          <w:sz w:val="28"/>
+        </w:rPr>
+        <w:t>жирный курсив</w:t>
+      </w:r>
+      <w:r>
+        <w:rPr>
+          <w:rFonts w:ascii="Times New Roman" w:hAnsi="Times New Roman"/>
+          <w:sz w:val="28"/>
+        </w:rPr>
+        <w:t xml:space="preserve">, </w:t>
+      </w:r>
+      <w:r>
+        <w:rPr>
+          <w:rFonts w:ascii="Times New Roman" w:hAnsi="Times New Roman"/>
+          <w:sz w:val="28"/>
+          <w:u w:val="single"/>
+        </w:rPr>
+        <w:t>подчёркнутый</w:t>
+      </w:r>
+      <w:r>
+        <w:rPr>
+          <w:rFonts w:ascii="Times New Roman" w:hAnsi="Times New Roman"/>
+          <w:sz w:val="28"/>
+        </w:rPr>
+        <w:t>. Неразрывный пробел склеивает «рис. 1» и «10 кг», чтобы их не разорвал перенос строки.</w:t>
       </w:r>
     </w:p>
     <w:p>
+      <w:pPr>
+        <w:spacing w:line="360" w:lineRule="auto" w:before="0" w:after="0"/>
+        <w:ind w:firstLine="709"/>
+        <w:jc w:val="both"/>
+      </w:pPr>
       <w:r>
+        <w:rPr>
+          <w:rFonts w:ascii="Times New Roman" w:hAnsi="Times New Roman"/>
+          <w:sz w:val="28"/>
+        </w:rPr>
         <w:t>На рисунке А.1.</w:t>
       </w:r>
     </w:p>
@@ -127,9 +271,25 @@
       </w:pPr>
       <w:r>
         <w:rPr>
+          <w:rFonts w:ascii="Times New Roman" w:hAnsi="Times New Roman"/>
           <w:sz w:val="28"/>
         </w:rPr>
-        <w:t>Рисунок А.1 – Пример подписи к рисунку. Пример подписи к рисунку. Пример подписи к рисунку. Пример подписи к рисунку. Пример подписи к рисунку</w:t>
+        <w:t xml:space="preserve">Рисунок А.1 – Пример подписи к рисунку с </w:t>
+      </w:r>
+      <w:r>
+        <w:rPr>
+          <w:rFonts w:ascii="Times New Roman" w:hAnsi="Times New Roman"/>
+          <w:i/>
+          <w:sz w:val="28"/>
+        </w:rPr>
+        <w:t>курсивом</w:t>
+      </w:r>
+      <w:r>
+        <w:rPr>
+          <w:rFonts w:ascii="Times New Roman" w:hAnsi="Times New Roman"/>
+          <w:sz w:val="28"/>
+        </w:rPr>
+        <w:t>. Пример подписи к рисунку. Пример подписи к рисунку. Пример подписи к рисунку. Пример подписи к рисунку</w:t>
       </w:r>
     </w:p>
     <w:p>
@@ -141,6 +301,7 @@
       </w:pPr>
       <w:r>
         <w:rPr>
+          <w:rFonts w:ascii="Times New Roman" w:hAnsi="Times New Roman"/>
           <w:sz w:val="28"/>
         </w:rPr>
         <w:t>Таблица А.1 – Таблица по умолчанию: со столбцом «№ п/п» и строкой номеров столбцов</w:t>
@@ -497,9 +658,41 @@
       </w:pPr>
       <w:r>
         <w:rPr>
+          <w:rFonts w:ascii="Times New Roman" w:hAnsi="Times New Roman"/>
           <w:sz w:val="28"/>
         </w:rPr>
-        <w:t>Таблица А.2 – Без «№ п/п» и без строки номеров столбцов</w:t>
+        <w:t xml:space="preserve">Таблица А.2 – Подпись с </w:t>
+      </w:r>
+      <w:r>
+        <w:rPr>
+          <w:rFonts w:ascii="Times New Roman" w:hAnsi="Times New Roman"/>
+          <w:b/>
+          <w:sz w:val="28"/>
+        </w:rPr>
+        <w:t>жирным</w:t>
+      </w:r>
+      <w:r>
+        <w:rPr>
+          <w:rFonts w:ascii="Times New Roman" w:hAnsi="Times New Roman"/>
+          <w:sz w:val="28"/>
+        </w:rPr>
+        <w:t xml:space="preserve"> и </w:t>
+      </w:r>
+      <w:r>
+        <w:rPr>
+          <w:rFonts w:ascii="Times New Roman" w:hAnsi="Times New Roman"/>
+          <w:b/>
+          <w:i/>
+          <w:sz w:val="28"/>
+        </w:rPr>
+        <w:t>жирным курсивом</w:t>
+      </w:r>
+      <w:r>
+        <w:rPr>
+          <w:rFonts w:ascii="Times New Roman" w:hAnsi="Times New Roman"/>
+          <w:sz w:val="28"/>
+        </w:rPr>
+        <w:t xml:space="preserve"> (без «№ п/п» и номеров столбцов)</w:t>
       </w:r>
     </w:p>
     <w:tbl>
@@ -665,6 +858,7 @@
       </w:pPr>
       <w:r>
         <w:rPr>
+          <w:rFonts w:ascii="Times New Roman" w:hAnsi="Times New Roman"/>
           <w:sz w:val="28"/>
         </w:rPr>
         <w:t>Таблица А.3 – Без строки-заголовка (show_header=False)</w:t>
@@ -847,6 +1041,7 @@
       </w:pPr>
       <w:r>
         <w:rPr>
+          <w:rFonts w:ascii="Times New Roman" w:hAnsi="Times New Roman"/>
           <w:sz w:val="28"/>
         </w:rPr>
         <w:t>Таблица А.4 – Таблица сразу за другой таблицей</w:t>
@@ -1080,6 +1275,7 @@
       </w:pPr>
       <w:r>
         <w:rPr>
+          <w:rFonts w:ascii="Times New Roman" w:hAnsi="Times New Roman"/>
           <w:sz w:val="28"/>
         </w:rPr>
         <w:t>Таблица А.5 – Себестоимость с переносом на следующую страницу</w:t>
@@ -2888,109 +3084,6 @@
           </w:p>
         </w:tc>
       </w:tr>
-      <w:tr>
-        <w:trPr>
-          <w:cantSplit/>
-        </w:trPr>
-        <w:tc>
-          <w:tcPr>
-            <w:tcW w:type="dxa" w:w="680"/>
-            <w:vAlign w:val="center"/>
-          </w:tcPr>
-          <w:p>
-            <w:pPr>
-              <w:pStyle w:val="TableText"/>
-            </w:pPr>
-            <w:r>
-              <w:t>16</w:t>
-            </w:r>
-          </w:p>
-        </w:tc>
-        <w:tc>
-          <w:tcPr>
-            <w:tcW w:type="dxa" w:w="1501"/>
-            <w:vAlign w:val="center"/>
-          </w:tcPr>
-          <w:p>
-            <w:pPr>
-              <w:pStyle w:val="TableText"/>
-            </w:pPr>
-            <w:r>
-              <w:t>ПГС</w:t>
-            </w:r>
-          </w:p>
-        </w:tc>
-        <w:tc>
-          <w:tcPr>
-            <w:tcW w:type="dxa" w:w="1501"/>
-            <w:vAlign w:val="center"/>
-          </w:tcPr>
-          <w:p>
-            <w:pPr>
-              <w:pStyle w:val="TableText"/>
-            </w:pPr>
-            <w:r>
-              <w:t>7241.0</w:t>
-            </w:r>
-          </w:p>
-        </w:tc>
-        <w:tc>
-          <w:tcPr>
-            <w:tcW w:type="dxa" w:w="1501"/>
-            <w:vAlign w:val="center"/>
-          </w:tcPr>
-          <w:p>
-            <w:pPr>
-              <w:pStyle w:val="TableText"/>
-            </w:pPr>
-            <w:r>
-              <w:t>172.20</w:t>
-            </w:r>
-          </w:p>
-        </w:tc>
-        <w:tc>
-          <w:tcPr>
-            <w:tcW w:type="dxa" w:w="1501"/>
-            <w:vAlign w:val="center"/>
-          </w:tcPr>
-          <w:p>
-            <w:pPr>
-              <w:pStyle w:val="TableText"/>
-            </w:pPr>
-            <w:r>
-              <w:t>301.80</w:t>
-            </w:r>
-          </w:p>
-        </w:tc>
-        <w:tc>
-          <w:tcPr>
-            <w:tcW w:type="dxa" w:w="1501"/>
-            <w:vAlign w:val="center"/>
-          </w:tcPr>
-          <w:p>
-            <w:pPr>
-              <w:pStyle w:val="TableText"/>
-            </w:pPr>
-            <w:r>
-              <w:t>146.82</w:t>
-            </w:r>
-          </w:p>
-        </w:tc>
-        <w:tc>
-          <w:tcPr>
-            <w:tcW w:type="dxa" w:w="1501"/>
-            <w:vAlign w:val="center"/>
-          </w:tcPr>
-          <w:p>
-            <w:pPr>
-              <w:pStyle w:val="TableText"/>
-            </w:pPr>
-            <w:r>
-              <w:t>298.60</w:t>
-            </w:r>
-          </w:p>
-        </w:tc>
-      </w:tr>
     </w:tbl>
     <w:p>
       <w:pPr>
@@ -3002,6 +3095,7 @@
       </w:pPr>
       <w:r>
         <w:rPr>
+          <w:rFonts w:ascii="Times New Roman" w:hAnsi="Times New Roman"/>
           <w:sz w:val="28"/>
         </w:rPr>
         <w:t>Продолжение таблицы А.5</w:t>
@@ -3279,6 +3373,109 @@
               <w:pStyle w:val="TableText"/>
             </w:pPr>
             <w:r>
+              <w:t>16</w:t>
+            </w:r>
+          </w:p>
+        </w:tc>
+        <w:tc>
+          <w:tcPr>
+            <w:tcW w:type="dxa" w:w="1501"/>
+            <w:vAlign w:val="center"/>
+          </w:tcPr>
+          <w:p>
+            <w:pPr>
+              <w:pStyle w:val="TableText"/>
+            </w:pPr>
+            <w:r>
+              <w:t>ПГС</w:t>
+            </w:r>
+          </w:p>
+        </w:tc>
+        <w:tc>
+          <w:tcPr>
+            <w:tcW w:type="dxa" w:w="1501"/>
+            <w:vAlign w:val="center"/>
+          </w:tcPr>
+          <w:p>
+            <w:pPr>
+              <w:pStyle w:val="TableText"/>
+            </w:pPr>
+            <w:r>
+              <w:t>7241.0</w:t>
+            </w:r>
+          </w:p>
+        </w:tc>
+        <w:tc>
+          <w:tcPr>
+            <w:tcW w:type="dxa" w:w="1501"/>
+            <w:vAlign w:val="center"/>
+          </w:tcPr>
+          <w:p>
+            <w:pPr>
+              <w:pStyle w:val="TableText"/>
+            </w:pPr>
+            <w:r>
+              <w:t>172.20</w:t>
+            </w:r>
+          </w:p>
+        </w:tc>
+        <w:tc>
+          <w:tcPr>
+            <w:tcW w:type="dxa" w:w="1501"/>
+            <w:vAlign w:val="center"/>
+          </w:tcPr>
+          <w:p>
+            <w:pPr>
+              <w:pStyle w:val="TableText"/>
+            </w:pPr>
+            <w:r>
+              <w:t>301.80</w:t>
+            </w:r>
+          </w:p>
+        </w:tc>
+        <w:tc>
+          <w:tcPr>
+            <w:tcW w:type="dxa" w:w="1501"/>
+            <w:vAlign w:val="center"/>
+          </w:tcPr>
+          <w:p>
+            <w:pPr>
+              <w:pStyle w:val="TableText"/>
+            </w:pPr>
+            <w:r>
+              <w:t>146.82</w:t>
+            </w:r>
+          </w:p>
+        </w:tc>
+        <w:tc>
+          <w:tcPr>
+            <w:tcW w:type="dxa" w:w="1501"/>
+            <w:vAlign w:val="center"/>
+          </w:tcPr>
+          <w:p>
+            <w:pPr>
+              <w:pStyle w:val="TableText"/>
+            </w:pPr>
+            <w:r>
+              <w:t>298.60</w:t>
+            </w:r>
+          </w:p>
+        </w:tc>
+      </w:tr>
+      <w:tr>
+        <w:trPr>
+          <w:cantSplit/>
+        </w:trPr>
+        <w:tc>
+          <w:tcPr>
+            <w:tcW w:type="dxa" w:w="680"/>
+            <w:vAlign w:val="center"/>
+          </w:tcPr>
+          <w:p>
+            <w:pPr>
+              <w:pStyle w:val="TableText"/>
+            </w:pPr>
+            <w:r>
               <w:t>17</w:t>
             </w:r>
           </w:p>
@@ -6779,7 +6976,16 @@
       </w:pPr>
     </w:p>
     <w:p>
+      <w:pPr>
+        <w:spacing w:line="360" w:lineRule="auto" w:before="0" w:after="0"/>
+        <w:ind w:firstLine="709"/>
+        <w:jc w:val="both"/>
+      </w:pPr>
       <w:r>
+        <w:rPr>
+          <w:rFonts w:ascii="Times New Roman" w:hAnsi="Times New Roman"/>
+          <w:sz w:val="28"/>
+        </w:rPr>
         <w:t>Этот абзац открывает новый раздел на новой странице.</w:t>
       </w:r>
     </w:p>
@@ -6789,10 +6995,521 @@
       </w:r>
     </w:p>
     <w:p>
+      <w:pPr>
+        <w:spacing w:line="360" w:lineRule="auto" w:before="0" w:after="0"/>
+        <w:ind w:firstLine="709"/>
+        <w:jc w:val="both"/>
+      </w:pPr>
       <w:r>
+        <w:rPr>
+          <w:rFonts w:ascii="Times New Roman" w:hAnsi="Times New Roman"/>
+          <w:sz w:val="28"/>
+        </w:rPr>
         <w:t>Этот абзац начинается с новой страницы того же раздела.</w:t>
       </w:r>
     </w:p>
+    <w:p>
+      <w:pPr>
+        <w:pStyle w:val="Heading1"/>
+        <w:spacing w:line="360" w:lineRule="auto" w:before="0" w:after="0"/>
+        <w:ind w:firstLine="0"/>
+        <w:jc w:val="center"/>
+      </w:pPr>
+      <w:r>
+        <w:rPr>
+          <w:rFonts w:ascii="Times New Roman" w:hAnsi="Times New Roman"/>
+          <w:b/>
+          <w:i w:val="0"/>
+          <w:caps/>
+          <w:color w:val="000000"/>
+          <w:sz w:val="28"/>
+        </w:rPr>
+        <w:t>Настройка стилей</w:t>
+      </w:r>
+    </w:p>
+    <w:p>
+      <w:pPr>
+        <w:keepNext/>
+        <w:spacing w:line="240" w:lineRule="auto" w:after="120"/>
+        <w:ind w:firstLine="0"/>
+        <w:jc w:val="left"/>
+      </w:pPr>
+      <w:r>
+        <w:rPr>
+          <w:rFonts w:ascii="Times New Roman" w:hAnsi="Times New Roman"/>
+          <w:b/>
+          <w:sz w:val="28"/>
+        </w:rPr>
+        <w:t>Таблица А.6 – Локальный стиль этой таблицы</w:t>
+      </w:r>
+    </w:p>
+    <w:tbl>
+      <w:tblPr>
+        <w:tblStyle w:val="TableGrid"/>
+        <w:tblW w:type="auto" w:w="0"/>
+        <w:jc w:val="center"/>
+        <w:tblLayout w:type="fixed"/>
+        <w:tblLook w:firstColumn="1" w:firstRow="1" w:lastColumn="0" w:lastRow="0" w:noHBand="0" w:noVBand="1" w:val="04A0"/>
+      </w:tblPr>
+      <w:tblGrid>
+        <w:gridCol w:w="680"/>
+        <w:gridCol w:w="4504"/>
+        <w:gridCol w:w="4504"/>
+      </w:tblGrid>
+      <w:tr>
+        <w:trPr>
+          <w:cantSplit/>
+          <w:tblHeader/>
+        </w:trPr>
+        <w:tc>
+          <w:tcPr>
+            <w:tcW w:type="dxa" w:w="680"/>
+            <w:vAlign w:val="center"/>
+          </w:tcPr>
+          <w:p>
+            <w:pPr>
+              <w:pStyle w:val="TableTextcc949dc4"/>
+              <w:keepNext/>
+            </w:pPr>
+            <w:r>
+              <w:t>№ п/п</w:t>
+            </w:r>
+          </w:p>
+        </w:tc>
+        <w:tc>
+          <w:tcPr>
+            <w:tcW w:type="dxa" w:w="4504"/>
+            <w:vAlign w:val="center"/>
+          </w:tcPr>
+          <w:p>
+            <w:pPr>
+              <w:pStyle w:val="TableTextcc949dc4"/>
+              <w:keepNext/>
+            </w:pPr>
+            <w:r>
+              <w:t>Параметр</w:t>
+            </w:r>
+          </w:p>
+        </w:tc>
+        <w:tc>
+          <w:tcPr>
+            <w:tcW w:type="dxa" w:w="4504"/>
+            <w:vAlign w:val="center"/>
+          </w:tcPr>
+          <w:p>
+            <w:pPr>
+              <w:pStyle w:val="TableTextcc949dc4"/>
+              <w:keepNext/>
+            </w:pPr>
+            <w:r>
+              <w:t>Значение</w:t>
+            </w:r>
+          </w:p>
+        </w:tc>
+      </w:tr>
+      <w:tr>
+        <w:trPr>
+          <w:cantSplit/>
+          <w:tblHeader/>
+        </w:trPr>
+        <w:tc>
+          <w:tcPr>
+            <w:tcW w:type="dxa" w:w="680"/>
+            <w:tcBorders>
+              <w:bottom w:val="double" w:sz="4" w:space="0" w:color="auto"/>
+            </w:tcBorders>
+            <w:vAlign w:val="center"/>
+          </w:tcPr>
+          <w:p>
+            <w:pPr>
+              <w:pStyle w:val="TableTextcc949dc4"/>
+              <w:keepNext/>
+            </w:pPr>
+            <w:r>
+              <w:t>1</w:t>
+            </w:r>
+          </w:p>
+        </w:tc>
+        <w:tc>
+          <w:tcPr>
+            <w:tcW w:type="dxa" w:w="4504"/>
+            <w:tcBorders>
+              <w:bottom w:val="double" w:sz="4" w:space="0" w:color="auto"/>
+            </w:tcBorders>
+            <w:vAlign w:val="center"/>
+          </w:tcPr>
+          <w:p>
+            <w:pPr>
+              <w:pStyle w:val="TableTextcc949dc4"/>
+              <w:keepNext/>
+            </w:pPr>
+            <w:r>
+              <w:t>2</w:t>
+            </w:r>
+          </w:p>
+        </w:tc>
+        <w:tc>
+          <w:tcPr>
+            <w:tcW w:type="dxa" w:w="4504"/>
+            <w:tcBorders>
+              <w:bottom w:val="double" w:sz="4" w:space="0" w:color="auto"/>
+            </w:tcBorders>
+            <w:vAlign w:val="center"/>
+          </w:tcPr>
+          <w:p>
+            <w:pPr>
+              <w:pStyle w:val="TableTextcc949dc4"/>
+              <w:keepNext/>
+            </w:pPr>
+            <w:r>
+              <w:t>3</w:t>
+            </w:r>
+          </w:p>
+        </w:tc>
+      </w:tr>
+      <w:tr>
+        <w:trPr>
+          <w:cantSplit/>
+        </w:trPr>
+        <w:tc>
+          <w:tcPr>
+            <w:tcW w:type="dxa" w:w="680"/>
+            <w:vAlign w:val="center"/>
+          </w:tcPr>
+          <w:p>
+            <w:pPr>
+              <w:pStyle w:val="TableTextcc949dc4"/>
+            </w:pPr>
+            <w:r>
+              <w:t>1</w:t>
+            </w:r>
+          </w:p>
+        </w:tc>
+        <w:tc>
+          <w:tcPr>
+            <w:tcW w:type="dxa" w:w="4504"/>
+            <w:vAlign w:val="center"/>
+          </w:tcPr>
+          <w:p>
+            <w:pPr>
+              <w:pStyle w:val="TableTextcc949dc4"/>
+            </w:pPr>
+            <w:r>
+              <w:t>Шрифт ячеек</w:t>
+            </w:r>
+          </w:p>
+        </w:tc>
+        <w:tc>
+          <w:tcPr>
+            <w:tcW w:type="dxa" w:w="4504"/>
+            <w:vAlign w:val="center"/>
+          </w:tcPr>
+          <w:p>
+            <w:pPr>
+              <w:pStyle w:val="TableTextcc949dc4"/>
+            </w:pPr>
+            <w:r>
+              <w:t>16 pt</w:t>
+            </w:r>
+          </w:p>
+        </w:tc>
+      </w:tr>
+      <w:tr>
+        <w:trPr>
+          <w:cantSplit/>
+        </w:trPr>
+        <w:tc>
+          <w:tcPr>
+            <w:tcW w:type="dxa" w:w="680"/>
+            <w:vAlign w:val="center"/>
+          </w:tcPr>
+          <w:p>
+            <w:pPr>
+              <w:pStyle w:val="TableTextcc949dc4"/>
+            </w:pPr>
+            <w:r>
+              <w:t>2</w:t>
+            </w:r>
+          </w:p>
+        </w:tc>
+        <w:tc>
+          <w:tcPr>
+            <w:tcW w:type="dxa" w:w="4504"/>
+            <w:vAlign w:val="center"/>
+          </w:tcPr>
+          <w:p>
+            <w:pPr>
+              <w:pStyle w:val="TableTextcc949dc4"/>
+            </w:pPr>
+            <w:r>
+              <w:t>Подпись</w:t>
+            </w:r>
+          </w:p>
+        </w:tc>
+        <w:tc>
+          <w:tcPr>
+            <w:tcW w:type="dxa" w:w="4504"/>
+            <w:vAlign w:val="center"/>
+          </w:tcPr>
+          <w:p>
+            <w:pPr>
+              <w:pStyle w:val="TableTextcc949dc4"/>
+            </w:pPr>
+            <w:r>
+              <w:t>жирная</w:t>
+            </w:r>
+          </w:p>
+        </w:tc>
+      </w:tr>
+    </w:tbl>
+    <w:p>
+      <w:pPr>
+        <w:spacing w:line="360" w:lineRule="auto" w:before="0" w:after="0"/>
+        <w:ind w:firstLine="709"/>
+        <w:jc w:val="both"/>
+      </w:pPr>
+      <w:r>
+        <w:rPr>
+          <w:rFonts w:ascii="Times New Roman" w:hAnsi="Times New Roman"/>
+          <w:sz w:val="20"/>
+        </w:rPr>
+        <w:t>После правки factory.style последующий обычный текст идёт шрифтом 10 pt.</w:t>
+      </w:r>
+    </w:p>
+    <w:p>
+      <w:pPr>
+        <w:keepNext/>
+        <w:spacing w:line="240" w:lineRule="auto" w:after="120"/>
+        <w:ind w:firstLine="0"/>
+        <w:jc w:val="left"/>
+      </w:pPr>
+      <w:r>
+        <w:rPr>
+          <w:rFonts w:ascii="Times New Roman" w:hAnsi="Times New Roman"/>
+          <w:sz w:val="28"/>
+        </w:rPr>
+        <w:t>Таблица А.7 – Глобальный стиль: моноширинный шрифт в ячейках</w:t>
+      </w:r>
+    </w:p>
+    <w:tbl>
+      <w:tblPr>
+        <w:tblStyle w:val="TableGrid"/>
+        <w:tblW w:type="auto" w:w="0"/>
+        <w:jc w:val="center"/>
+        <w:tblLayout w:type="fixed"/>
+        <w:tblLook w:firstColumn="1" w:firstRow="1" w:lastColumn="0" w:lastRow="0" w:noHBand="0" w:noVBand="1" w:val="04A0"/>
+      </w:tblPr>
+      <w:tblGrid>
+        <w:gridCol w:w="680"/>
+        <w:gridCol w:w="4504"/>
+        <w:gridCol w:w="4504"/>
+      </w:tblGrid>
+      <w:tr>
+        <w:trPr>
+          <w:cantSplit/>
+          <w:tblHeader/>
+        </w:trPr>
+        <w:tc>
+          <w:tcPr>
+            <w:tcW w:type="dxa" w:w="680"/>
+            <w:vAlign w:val="center"/>
+          </w:tcPr>
+          <w:p>
+            <w:pPr>
+              <w:pStyle w:val="TableTextbbe10661"/>
+              <w:keepNext/>
+            </w:pPr>
+            <w:r>
+              <w:t>№ п/п</w:t>
+            </w:r>
+          </w:p>
+        </w:tc>
+        <w:tc>
+          <w:tcPr>
+            <w:tcW w:type="dxa" w:w="4504"/>
+            <w:vAlign w:val="center"/>
+          </w:tcPr>
+          <w:p>
+            <w:pPr>
+              <w:pStyle w:val="TableTextbbe10661"/>
+              <w:keepNext/>
+            </w:pPr>
+            <w:r>
+              <w:t>Код</w:t>
+            </w:r>
+          </w:p>
+        </w:tc>
+        <w:tc>
+          <w:tcPr>
+            <w:tcW w:type="dxa" w:w="4504"/>
+            <w:vAlign w:val="center"/>
+          </w:tcPr>
+          <w:p>
+            <w:pPr>
+              <w:pStyle w:val="TableTextbbe10661"/>
+              <w:keepNext/>
+            </w:pPr>
+            <w:r>
+              <w:t>Описание</w:t>
+            </w:r>
+          </w:p>
+        </w:tc>
+      </w:tr>
+      <w:tr>
+        <w:trPr>
+          <w:cantSplit/>
+          <w:tblHeader/>
+        </w:trPr>
+        <w:tc>
+          <w:tcPr>
+            <w:tcW w:type="dxa" w:w="680"/>
+            <w:tcBorders>
+              <w:bottom w:val="double" w:sz="4" w:space="0" w:color="auto"/>
+            </w:tcBorders>
+            <w:vAlign w:val="center"/>
+          </w:tcPr>
+          <w:p>
+            <w:pPr>
+              <w:pStyle w:val="TableTextbbe10661"/>
+              <w:keepNext/>
+            </w:pPr>
+            <w:r>
+              <w:t>1</w:t>
+            </w:r>
+          </w:p>
+        </w:tc>
+        <w:tc>
+          <w:tcPr>
+            <w:tcW w:type="dxa" w:w="4504"/>
+            <w:tcBorders>
+              <w:bottom w:val="double" w:sz="4" w:space="0" w:color="auto"/>
+            </w:tcBorders>
+            <w:vAlign w:val="center"/>
+          </w:tcPr>
+          <w:p>
+            <w:pPr>
+              <w:pStyle w:val="TableTextbbe10661"/>
+              <w:keepNext/>
+            </w:pPr>
+            <w:r>
+              <w:t>2</w:t>
+            </w:r>
+          </w:p>
+        </w:tc>
+        <w:tc>
+          <w:tcPr>
+            <w:tcW w:type="dxa" w:w="4504"/>
+            <w:tcBorders>
+              <w:bottom w:val="double" w:sz="4" w:space="0" w:color="auto"/>
+            </w:tcBorders>
+            <w:vAlign w:val="center"/>
+          </w:tcPr>
+          <w:p>
+            <w:pPr>
+              <w:pStyle w:val="TableTextbbe10661"/>
+              <w:keepNext/>
+            </w:pPr>
+            <w:r>
+              <w:t>3</w:t>
+            </w:r>
+          </w:p>
+        </w:tc>
+      </w:tr>
+      <w:tr>
+        <w:trPr>
+          <w:cantSplit/>
+        </w:trPr>
+        <w:tc>
+          <w:tcPr>
+            <w:tcW w:type="dxa" w:w="680"/>
+            <w:vAlign w:val="center"/>
+          </w:tcPr>
+          <w:p>
+            <w:pPr>
+              <w:pStyle w:val="TableTextbbe10661"/>
+            </w:pPr>
+            <w:r>
+              <w:t>1</w:t>
+            </w:r>
+          </w:p>
+        </w:tc>
+        <w:tc>
+          <w:tcPr>
+            <w:tcW w:type="dxa" w:w="4504"/>
+            <w:vAlign w:val="center"/>
+          </w:tcPr>
+          <w:p>
+            <w:pPr>
+              <w:pStyle w:val="TableTextbbe10661"/>
+            </w:pPr>
+            <w:r>
+              <w:t>A1</w:t>
+            </w:r>
+          </w:p>
+        </w:tc>
+        <w:tc>
+          <w:tcPr>
+            <w:tcW w:type="dxa" w:w="4504"/>
+            <w:vAlign w:val="center"/>
+          </w:tcPr>
+          <w:p>
+            <w:pPr>
+              <w:pStyle w:val="TableTextbbe10661"/>
+            </w:pPr>
+            <w:r>
+              <w:t>первый</w:t>
+            </w:r>
+          </w:p>
+        </w:tc>
+      </w:tr>
+      <w:tr>
+        <w:trPr>
+          <w:cantSplit/>
+        </w:trPr>
+        <w:tc>
+          <w:tcPr>
+            <w:tcW w:type="dxa" w:w="680"/>
+            <w:vAlign w:val="center"/>
+          </w:tcPr>
+          <w:p>
+            <w:pPr>
+              <w:pStyle w:val="TableTextbbe10661"/>
+            </w:pPr>
+            <w:r>
+              <w:t>2</w:t>
+            </w:r>
+          </w:p>
+        </w:tc>
+        <w:tc>
+          <w:tcPr>
+            <w:tcW w:type="dxa" w:w="4504"/>
+            <w:vAlign w:val="center"/>
+          </w:tcPr>
+          <w:p>
+            <w:pPr>
+              <w:pStyle w:val="TableTextbbe10661"/>
+            </w:pPr>
+            <w:r>
+              <w:t>B2</w:t>
+            </w:r>
+          </w:p>
+        </w:tc>
+        <w:tc>
+          <w:tcPr>
+            <w:tcW w:type="dxa" w:w="4504"/>
+            <w:vAlign w:val="center"/>
+          </w:tcPr>
+          <w:p>
+            <w:pPr>
+              <w:pStyle w:val="TableTextbbe10661"/>
+            </w:pPr>
+            <w:r>
+              <w:t>второй</w:t>
+            </w:r>
+          </w:p>
+        </w:tc>
+      </w:tr>
+    </w:tbl>
     <w:sectPr>
       <w:pgSz w:w="12240" w:h="15840"/>
       <w:pgMar w:top="1134" w:right="850" w:bottom="1134" w:left="1701" w:header="720" w:footer="720" w:gutter="0"/>
@@ -18890,6 +19607,30 @@
     </w:pPr>
     <w:rPr>
       <w:rFonts w:ascii="Times New Roman" w:hAnsi="Times New Roman"/>
+      <w:sz w:val="24"/>
+    </w:rPr>
+  </w:style>
+  <w:style w:type="paragraph" w:customStyle="1" w:styleId="TableTextcc949dc4">
+    <w:name w:val="Table Text cc949dc4"/>
+    <w:pPr>
+      <w:spacing w:before="0" w:after="0"/>
+      <w:ind w:firstLine="0"/>
+      <w:jc w:val="center"/>
+    </w:pPr>
+    <w:rPr>
+      <w:rFonts w:ascii="Times New Roman" w:hAnsi="Times New Roman"/>
+      <w:sz w:val="32"/>
+    </w:rPr>
+  </w:style>
+  <w:style w:type="paragraph" w:customStyle="1" w:styleId="TableTextbbe10661">
+    <w:name w:val="Table Text bbe10661"/>
+    <w:pPr>
+      <w:spacing w:before="0" w:after="0"/>
+      <w:ind w:firstLine="0"/>
+      <w:jc w:val="center"/>
+    </w:pPr>
+    <w:rPr>
+      <w:rFonts w:ascii="Courier New" w:hAnsi="Courier New"/>
       <w:sz w:val="24"/>
     </w:rPr>
   </w:style>

</xml_diff>

<commit_message>
feat: implement formula to current code
</commit_message>
<xml_diff>
--- a/examples/example.docx
+++ b/examples/example.docx
@@ -6965,6 +6965,704 @@
         </w:tc>
       </w:tr>
     </w:tbl>
+    <w:p>
+      <w:pPr>
+        <w:pStyle w:val="Heading1"/>
+        <w:spacing w:line="360" w:lineRule="auto" w:before="0" w:after="0"/>
+        <w:ind w:firstLine="0"/>
+        <w:jc w:val="center"/>
+      </w:pPr>
+      <w:r>
+        <w:rPr>
+          <w:rFonts w:ascii="Times New Roman" w:hAnsi="Times New Roman"/>
+          <w:b/>
+          <w:i w:val="0"/>
+          <w:caps/>
+          <w:color w:val="000000"/>
+          <w:sz w:val="28"/>
+        </w:rPr>
+        <w:t>Формулы</w:t>
+      </w:r>
+    </w:p>
+    <w:p>
+      <w:pPr>
+        <w:spacing w:line="360" w:lineRule="auto" w:before="0" w:after="0"/>
+        <w:ind w:firstLine="709"/>
+        <w:jc w:val="both"/>
+      </w:pPr>
+      <w:r>
+        <w:rPr>
+          <w:rFonts w:ascii="Times New Roman" w:hAnsi="Times New Roman"/>
+          <w:sz w:val="28"/>
+        </w:rPr>
+        <w:t>Кинетическая энергия вычисляется по формуле (А.1).</w:t>
+      </w:r>
+    </w:p>
+    <w:p>
+      <w:pPr>
+        <w:keepNext/>
+        <w:spacing w:line="240" w:lineRule="auto" w:before="280" w:after="0"/>
+        <w:ind w:firstLine="0"/>
+      </w:pPr>
+      <m:oMathPara>
+        <m:oMath>
+          <m:eqArr>
+            <m:eqArrPr>
+              <m:maxDist m:val="1"/>
+            </m:eqArrPr>
+            <m:e>
+              <m:r>
+                <m:t>E</m:t>
+              </m:r>
+              <m:r>
+                <m:t>=</m:t>
+              </m:r>
+              <m:f>
+                <m:num>
+                  <m:r>
+                    <m:t>m</m:t>
+                  </m:r>
+                  <m:sSup>
+                    <m:e>
+                      <m:r>
+                        <m:t>v</m:t>
+                      </m:r>
+                    </m:e>
+                    <m:sup>
+                      <m:r>
+                        <m:t>2</m:t>
+                      </m:r>
+                    </m:sup>
+                  </m:sSup>
+                </m:num>
+                <m:den>
+                  <m:r>
+                    <m:t>2</m:t>
+                  </m:r>
+                </m:den>
+              </m:f>
+              <m:r>
+                <m:t xml:space="preserve"> #</m:t>
+              </m:r>
+              <m:d>
+                <m:e>
+                  <m:r>
+                    <m:rPr>
+                      <m:nor/>
+                    </m:rPr>
+                    <m:t xml:space="preserve">А.1</m:t>
+                  </m:r>
+                </m:e>
+              </m:d>
+            </m:e>
+          </m:eqArr>
+        </m:oMath>
+      </m:oMathPara>
+    </w:p>
+    <w:p>
+      <w:pPr>
+        <w:spacing w:line="360" w:lineRule="auto" w:before="0" w:after="0"/>
+        <w:ind w:firstLine="0"/>
+        <w:jc w:val="both"/>
+      </w:pPr>
+      <w:r>
+        <w:rPr>
+          <w:rFonts w:ascii="Times New Roman" w:hAnsi="Times New Roman"/>
+          <w:sz w:val="28"/>
+        </w:rPr>
+        <w:t>где m – масса тела, кг;</w:t>
+      </w:r>
+    </w:p>
+    <w:p>
+      <w:pPr>
+        <w:spacing w:line="360" w:lineRule="auto" w:before="0" w:after="0"/>
+        <w:ind w:firstLine="0"/>
+        <w:jc w:val="both"/>
+      </w:pPr>
+      <w:r>
+        <w:rPr>
+          <w:rFonts w:ascii="Times New Roman" w:hAnsi="Times New Roman"/>
+          <w:sz w:val="28"/>
+        </w:rPr>
+        <w:t>v – скорость тела, м/с.</w:t>
+      </w:r>
+    </w:p>
+    <w:p>
+      <w:pPr>
+        <w:spacing w:line="360" w:lineRule="auto" w:before="0" w:after="0"/>
+        <w:ind w:firstLine="709"/>
+        <w:jc w:val="both"/>
+      </w:pPr>
+      <w:r>
+        <w:rPr>
+          <w:rFonts w:ascii="Times New Roman" w:hAnsi="Times New Roman"/>
+          <w:sz w:val="28"/>
+        </w:rPr>
+        <w:t>Ненумерованная формула идёт просто по центру:</w:t>
+      </w:r>
+    </w:p>
+    <w:p>
+      <w:pPr>
+        <w:spacing w:line="240" w:lineRule="auto" w:before="280" w:after="280"/>
+        <w:ind w:firstLine="0"/>
+      </w:pPr>
+      <m:oMathPara>
+        <m:oMath>
+          <m:sSup>
+            <m:e>
+              <m:r>
+                <m:t>a</m:t>
+              </m:r>
+            </m:e>
+            <m:sup>
+              <m:r>
+                <m:t>2</m:t>
+              </m:r>
+            </m:sup>
+          </m:sSup>
+          <m:r>
+            <m:t>+</m:t>
+          </m:r>
+          <m:sSup>
+            <m:e>
+              <m:r>
+                <m:t>b</m:t>
+              </m:r>
+            </m:e>
+            <m:sup>
+              <m:r>
+                <m:t>2</m:t>
+              </m:r>
+            </m:sup>
+          </m:sSup>
+          <m:r>
+            <m:t>=</m:t>
+          </m:r>
+          <m:sSup>
+            <m:e>
+              <m:r>
+                <m:t>c</m:t>
+              </m:r>
+            </m:e>
+            <m:sup>
+              <m:r>
+                <m:t>2</m:t>
+              </m:r>
+            </m:sup>
+          </m:sSup>
+        </m:oMath>
+      </m:oMathPara>
+    </w:p>
+    <w:p>
+      <w:pPr>
+        <w:spacing w:line="360" w:lineRule="auto" w:before="0" w:after="0"/>
+        <w:ind w:firstLine="709"/>
+        <w:jc w:val="both"/>
+      </w:pPr>
+      <w:r>
+        <w:rPr>
+          <w:rFonts w:ascii="Times New Roman" w:hAnsi="Times New Roman"/>
+          <w:sz w:val="28"/>
+        </w:rPr>
+        <w:t>Среднеквадратическое отклонение — вложенные радикал, дробь и сумма:</w:t>
+      </w:r>
+    </w:p>
+    <w:p>
+      <w:pPr>
+        <w:keepNext/>
+        <w:spacing w:line="240" w:lineRule="auto" w:before="280" w:after="0"/>
+        <w:ind w:firstLine="0"/>
+      </w:pPr>
+      <m:oMathPara>
+        <m:oMath>
+          <m:eqArr>
+            <m:eqArrPr>
+              <m:maxDist m:val="1"/>
+            </m:eqArrPr>
+            <m:e>
+              <m:r>
+                <m:t>σ</m:t>
+              </m:r>
+              <m:r>
+                <m:t>=</m:t>
+              </m:r>
+              <m:rad>
+                <m:radPr>
+                  <m:degHide m:val="on"/>
+                </m:radPr>
+                <m:deg/>
+                <m:e>
+                  <m:f>
+                    <m:num>
+                      <m:nary>
+                        <m:naryPr>
+                          <m:chr m:val="∑"/>
+                          <m:limLoc m:val="undOvr"/>
+                          <m:subHide m:val="off"/>
+                          <m:supHide m:val="off"/>
+                        </m:naryPr>
+                        <m:sub>
+                          <m:r>
+                            <m:t>i</m:t>
+                          </m:r>
+                          <m:r>
+                            <m:t>=</m:t>
+                          </m:r>
+                          <m:r>
+                            <m:t>1</m:t>
+                          </m:r>
+                        </m:sub>
+                        <m:sup>
+                          <m:r>
+                            <m:t>n</m:t>
+                          </m:r>
+                        </m:sup>
+                        <m:e>
+                          <m:sSup>
+                            <m:e>
+                              <m:d>
+                                <m:dPr>
+                                  <m:begChr m:val="("/>
+                                  <m:endChr m:val=")"/>
+                                </m:dPr>
+                                <m:e>
+                                  <m:sSub>
+                                    <m:e>
+                                      <m:r>
+                                        <m:t>x</m:t>
+                                      </m:r>
+                                    </m:e>
+                                    <m:sub>
+                                      <m:r>
+                                        <m:t>i</m:t>
+                                      </m:r>
+                                    </m:sub>
+                                  </m:sSub>
+                                  <m:r>
+                                    <m:t>−</m:t>
+                                  </m:r>
+                                  <m:acc>
+                                    <m:accPr>
+                                      <m:chr m:val="̅"/>
+                                    </m:accPr>
+                                    <m:e>
+                                      <m:r>
+                                        <m:t>x</m:t>
+                                      </m:r>
+                                    </m:e>
+                                  </m:acc>
+                                </m:e>
+                              </m:d>
+                            </m:e>
+                            <m:sup>
+                              <m:r>
+                                <m:t>2</m:t>
+                              </m:r>
+                            </m:sup>
+                          </m:sSup>
+                        </m:e>
+                      </m:nary>
+                    </m:num>
+                    <m:den>
+                      <m:r>
+                        <m:t>n</m:t>
+                      </m:r>
+                      <m:r>
+                        <m:t>−</m:t>
+                      </m:r>
+                      <m:r>
+                        <m:t>1</m:t>
+                      </m:r>
+                    </m:den>
+                  </m:f>
+                </m:e>
+              </m:rad>
+              <m:r>
+                <m:t xml:space="preserve"> #</m:t>
+              </m:r>
+              <m:d>
+                <m:e>
+                  <m:r>
+                    <m:rPr>
+                      <m:nor/>
+                    </m:rPr>
+                    <m:t xml:space="preserve">А.2</m:t>
+                  </m:r>
+                </m:e>
+              </m:d>
+            </m:e>
+          </m:eqArr>
+        </m:oMath>
+      </m:oMathPara>
+    </w:p>
+    <w:p>
+      <w:pPr>
+        <w:spacing w:line="360" w:lineRule="auto" w:before="0" w:after="0"/>
+        <w:ind w:firstLine="0"/>
+        <w:jc w:val="both"/>
+      </w:pPr>
+      <w:r>
+        <w:rPr>
+          <w:rFonts w:ascii="Times New Roman" w:hAnsi="Times New Roman"/>
+          <w:sz w:val="28"/>
+        </w:rPr>
+        <w:t xml:space="preserve">где </w:t>
+      </w:r>
+      <w:r>
+        <w:rPr>
+          <w:rFonts w:ascii="Times New Roman" w:hAnsi="Times New Roman"/>
+          <w:i/>
+          <w:sz w:val="28"/>
+        </w:rPr>
+        <w:t>x</w:t>
+      </w:r>
+      <w:r>
+        <w:rPr>
+          <w:rFonts w:ascii="Times New Roman" w:hAnsi="Times New Roman"/>
+          <w:sz w:val="28"/>
+        </w:rPr>
+        <w:t xml:space="preserve"> – значение отдельного измерения;</w:t>
+      </w:r>
+    </w:p>
+    <w:p>
+      <w:pPr>
+        <w:spacing w:line="360" w:lineRule="auto" w:before="0" w:after="0"/>
+        <w:ind w:firstLine="0"/>
+        <w:jc w:val="both"/>
+      </w:pPr>
+      <w:r>
+        <w:rPr>
+          <w:rFonts w:ascii="Times New Roman" w:hAnsi="Times New Roman"/>
+          <w:sz w:val="28"/>
+        </w:rPr>
+        <w:t>n – объём выборки.</w:t>
+      </w:r>
+    </w:p>
+    <w:p>
+      <w:pPr>
+        <w:spacing w:line="360" w:lineRule="auto" w:before="0" w:after="0"/>
+        <w:ind w:firstLine="709"/>
+        <w:jc w:val="both"/>
+      </w:pPr>
+      <w:r>
+        <w:rPr>
+          <w:rFonts w:ascii="Times New Roman" w:hAnsi="Times New Roman"/>
+          <w:sz w:val="28"/>
+        </w:rPr>
+        <w:t>Матрица, система уравнений и индексы кириллицей:</w:t>
+      </w:r>
+    </w:p>
+    <w:p>
+      <w:pPr>
+        <w:spacing w:line="240" w:lineRule="auto" w:before="280" w:after="280"/>
+        <w:ind w:firstLine="0"/>
+      </w:pPr>
+      <m:oMathPara>
+        <m:oMath>
+          <m:eqArr>
+            <m:eqArrPr>
+              <m:maxDist m:val="1"/>
+            </m:eqArrPr>
+            <m:e>
+              <m:r>
+                <m:t>A</m:t>
+              </m:r>
+              <m:r>
+                <m:t>=</m:t>
+              </m:r>
+              <m:d>
+                <m:dPr>
+                  <m:begChr m:val="("/>
+                  <m:endChr m:val=")"/>
+                </m:dPr>
+                <m:e>
+                  <m:m>
+                    <m:mr>
+                      <m:e>
+                        <m:sSub>
+                          <m:e>
+                            <m:r>
+                              <m:t>a</m:t>
+                            </m:r>
+                          </m:e>
+                          <m:sub>
+                            <m:r>
+                              <m:t>11</m:t>
+                            </m:r>
+                          </m:sub>
+                        </m:sSub>
+                      </m:e>
+                      <m:e>
+                        <m:sSub>
+                          <m:e>
+                            <m:r>
+                              <m:t>a</m:t>
+                            </m:r>
+                          </m:e>
+                          <m:sub>
+                            <m:r>
+                              <m:t>12</m:t>
+                            </m:r>
+                          </m:sub>
+                        </m:sSub>
+                      </m:e>
+                    </m:mr>
+                    <m:mr>
+                      <m:e>
+                        <m:sSub>
+                          <m:e>
+                            <m:r>
+                              <m:t>a</m:t>
+                            </m:r>
+                          </m:e>
+                          <m:sub>
+                            <m:r>
+                              <m:t>21</m:t>
+                            </m:r>
+                          </m:sub>
+                        </m:sSub>
+                      </m:e>
+                      <m:e>
+                        <m:sSub>
+                          <m:e>
+                            <m:r>
+                              <m:t>a</m:t>
+                            </m:r>
+                          </m:e>
+                          <m:sub>
+                            <m:r>
+                              <m:t>22</m:t>
+                            </m:r>
+                          </m:sub>
+                        </m:sSub>
+                      </m:e>
+                    </m:mr>
+                  </m:m>
+                </m:e>
+              </m:d>
+              <m:r>
+                <m:t xml:space="preserve"> #</m:t>
+              </m:r>
+              <m:d>
+                <m:e>
+                  <m:r>
+                    <m:rPr>
+                      <m:nor/>
+                    </m:rPr>
+                    <m:t xml:space="preserve">А.3</m:t>
+                  </m:r>
+                </m:e>
+              </m:d>
+            </m:e>
+          </m:eqArr>
+        </m:oMath>
+      </m:oMathPara>
+    </w:p>
+    <w:p>
+      <w:pPr>
+        <w:spacing w:line="240" w:lineRule="auto" w:before="280" w:after="280"/>
+        <w:ind w:firstLine="0"/>
+      </w:pPr>
+      <m:oMathPara>
+        <m:oMath>
+          <m:eqArr>
+            <m:eqArrPr>
+              <m:maxDist m:val="1"/>
+            </m:eqArrPr>
+            <m:e>
+              <m:r>
+                <m:t>f</m:t>
+              </m:r>
+              <m:d>
+                <m:dPr>
+                  <m:begChr m:val="("/>
+                  <m:endChr m:val=")"/>
+                </m:dPr>
+                <m:e>
+                  <m:r>
+                    <m:t>x</m:t>
+                  </m:r>
+                </m:e>
+              </m:d>
+              <m:r>
+                <m:t>=</m:t>
+              </m:r>
+              <m:d>
+                <m:dPr>
+                  <m:begChr m:val="{"/>
+                  <m:endChr m:val=""/>
+                </m:dPr>
+                <m:e>
+                  <m:m>
+                    <m:mPr>
+                      <m:mcs>
+                        <m:mc>
+                          <m:mcPr>
+                            <m:count m:val="2"/>
+                            <m:mcJc m:val="left"/>
+                          </m:mcPr>
+                        </m:mc>
+                      </m:mcs>
+                    </m:mPr>
+                    <m:mr>
+                      <m:e>
+                        <m:r>
+                          <m:t>x</m:t>
+                        </m:r>
+                        <m:r>
+                          <m:t>,</m:t>
+                        </m:r>
+                      </m:e>
+                      <m:e>
+                        <m:r>
+                          <m:t>x</m:t>
+                        </m:r>
+                        <m:r>
+                          <m:t>&gt;</m:t>
+                        </m:r>
+                        <m:r>
+                          <m:t>0</m:t>
+                        </m:r>
+                      </m:e>
+                    </m:mr>
+                    <m:mr>
+                      <m:e>
+                        <m:r>
+                          <m:t>0</m:t>
+                        </m:r>
+                        <m:r>
+                          <m:t>,</m:t>
+                        </m:r>
+                      </m:e>
+                      <m:e>
+                        <m:r>
+                          <m:t>x</m:t>
+                        </m:r>
+                        <m:r>
+                          <m:t>≤</m:t>
+                        </m:r>
+                        <m:r>
+                          <m:t>0</m:t>
+                        </m:r>
+                      </m:e>
+                    </m:mr>
+                  </m:m>
+                </m:e>
+              </m:d>
+              <m:r>
+                <m:t xml:space="preserve"> #</m:t>
+              </m:r>
+              <m:d>
+                <m:e>
+                  <m:r>
+                    <m:rPr>
+                      <m:nor/>
+                    </m:rPr>
+                    <m:t xml:space="preserve">А.4</m:t>
+                  </m:r>
+                </m:e>
+              </m:d>
+            </m:e>
+          </m:eqArr>
+        </m:oMath>
+      </m:oMathPara>
+    </w:p>
+    <w:p>
+      <w:pPr>
+        <w:spacing w:line="240" w:lineRule="auto" w:before="280" w:after="280"/>
+        <w:ind w:firstLine="0"/>
+      </w:pPr>
+      <m:oMathPara>
+        <m:oMath>
+          <m:eqArr>
+            <m:eqArrPr>
+              <m:maxDist m:val="1"/>
+            </m:eqArrPr>
+            <m:e>
+              <m:sSub>
+                <m:e>
+                  <m:r>
+                    <m:t>K</m:t>
+                  </m:r>
+                </m:e>
+                <m:sub>
+                  <m:r>
+                    <m:rPr>
+                      <m:nor/>
+                    </m:rPr>
+                    <m:t>сум</m:t>
+                  </m:r>
+                </m:sub>
+              </m:sSub>
+              <m:r>
+                <m:t>=</m:t>
+              </m:r>
+              <m:f>
+                <m:num>
+                  <m:sSub>
+                    <m:e>
+                      <m:r>
+                        <m:t>P</m:t>
+                      </m:r>
+                    </m:e>
+                    <m:sub>
+                      <m:r>
+                        <m:t>в</m:t>
+                      </m:r>
+                      <m:r>
+                        <m:t>х</m:t>
+                      </m:r>
+                    </m:sub>
+                  </m:sSub>
+                </m:num>
+                <m:den>
+                  <m:sSub>
+                    <m:e>
+                      <m:r>
+                        <m:t>P</m:t>
+                      </m:r>
+                    </m:e>
+                    <m:sub>
+                      <m:r>
+                        <m:t>в</m:t>
+                      </m:r>
+                      <m:r>
+                        <m:t>ы</m:t>
+                      </m:r>
+                      <m:r>
+                        <m:t>х</m:t>
+                      </m:r>
+                    </m:sub>
+                  </m:sSub>
+                </m:den>
+              </m:f>
+              <m:r>
+                <m:t>·</m:t>
+              </m:r>
+              <m:r>
+                <m:t>100</m:t>
+              </m:r>
+              <m:r>
+                <m:t>%</m:t>
+              </m:r>
+              <m:r>
+                <m:t xml:space="preserve"> #</m:t>
+              </m:r>
+              <m:d>
+                <m:e>
+                  <m:r>
+                    <m:rPr>
+                      <m:nor/>
+                    </m:rPr>
+                    <m:t xml:space="preserve">А.5</m:t>
+                  </m:r>
+                </m:e>
+              </m:d>
+            </m:e>
+          </m:eqArr>
+        </m:oMath>
+      </m:oMathPara>
+    </w:p>
     <w:p>
       <w:pPr>
         <w:sectPr>

</xml_diff>

<commit_message>
feat: add formula class with latex2omml convertor
</commit_message>
<xml_diff>
--- a/examples/example.docx
+++ b/examples/example.docx
@@ -6965,6 +6965,714 @@
         </w:tc>
       </w:tr>
     </w:tbl>
+    <w:p>
+      <w:pPr>
+        <w:sectPr>
+          <w:pgSz w:w="12240" w:h="15840"/>
+          <w:pgMar w:top="1134" w:right="850" w:bottom="1134" w:left="1701" w:header="720" w:footer="720" w:gutter="0"/>
+          <w:cols w:space="720"/>
+          <w:docGrid w:linePitch="360"/>
+        </w:sectPr>
+      </w:pPr>
+    </w:p>
+    <w:p>
+      <w:pPr>
+        <w:pStyle w:val="Heading1"/>
+        <w:spacing w:line="360" w:lineRule="auto" w:before="0" w:after="0"/>
+        <w:ind w:firstLine="0"/>
+        <w:jc w:val="center"/>
+      </w:pPr>
+      <w:r>
+        <w:rPr>
+          <w:rFonts w:ascii="Times New Roman" w:hAnsi="Times New Roman"/>
+          <w:b/>
+          <w:i w:val="0"/>
+          <w:caps/>
+          <w:color w:val="000000"/>
+          <w:sz w:val="28"/>
+        </w:rPr>
+        <w:t>Формулы</w:t>
+      </w:r>
+    </w:p>
+    <w:p>
+      <w:pPr>
+        <w:spacing w:line="360" w:lineRule="auto" w:before="0" w:after="0"/>
+        <w:ind w:firstLine="709"/>
+        <w:jc w:val="both"/>
+      </w:pPr>
+      <w:r>
+        <w:rPr>
+          <w:rFonts w:ascii="Times New Roman" w:hAnsi="Times New Roman"/>
+          <w:sz w:val="28"/>
+        </w:rPr>
+        <w:t>Кинетическая энергия вычисляется по формуле (А.1).</w:t>
+      </w:r>
+    </w:p>
+    <w:p>
+      <w:pPr>
+        <w:keepNext/>
+        <w:spacing w:line="240" w:lineRule="auto" w:before="280" w:after="0"/>
+        <w:ind w:firstLine="0"/>
+      </w:pPr>
+      <m:oMathPara>
+        <m:oMath>
+          <m:eqArr>
+            <m:eqArrPr>
+              <m:maxDist m:val="1"/>
+            </m:eqArrPr>
+            <m:e>
+              <m:r>
+                <m:t>E</m:t>
+              </m:r>
+              <m:r>
+                <m:t>=</m:t>
+              </m:r>
+              <m:f>
+                <m:num>
+                  <m:r>
+                    <m:t>m</m:t>
+                  </m:r>
+                  <m:sSup>
+                    <m:e>
+                      <m:r>
+                        <m:t>v</m:t>
+                      </m:r>
+                    </m:e>
+                    <m:sup>
+                      <m:r>
+                        <m:t>2</m:t>
+                      </m:r>
+                    </m:sup>
+                  </m:sSup>
+                </m:num>
+                <m:den>
+                  <m:r>
+                    <m:t>2</m:t>
+                  </m:r>
+                </m:den>
+              </m:f>
+              <m:r>
+                <m:t xml:space="preserve"> #</m:t>
+              </m:r>
+              <m:d>
+                <m:e>
+                  <m:r>
+                    <m:rPr>
+                      <m:nor/>
+                    </m:rPr>
+                    <m:t xml:space="preserve">А.1</m:t>
+                  </m:r>
+                </m:e>
+              </m:d>
+            </m:e>
+          </m:eqArr>
+        </m:oMath>
+      </m:oMathPara>
+    </w:p>
+    <w:p>
+      <w:pPr>
+        <w:spacing w:line="360" w:lineRule="auto" w:before="0" w:after="0"/>
+        <w:ind w:firstLine="0"/>
+        <w:jc w:val="both"/>
+      </w:pPr>
+      <w:r>
+        <w:rPr>
+          <w:rFonts w:ascii="Times New Roman" w:hAnsi="Times New Roman"/>
+          <w:sz w:val="28"/>
+        </w:rPr>
+        <w:t>где m – масса тела, кг;</w:t>
+      </w:r>
+    </w:p>
+    <w:p>
+      <w:pPr>
+        <w:spacing w:line="360" w:lineRule="auto" w:before="0" w:after="0"/>
+        <w:ind w:firstLine="0"/>
+        <w:jc w:val="both"/>
+      </w:pPr>
+      <w:r>
+        <w:rPr>
+          <w:rFonts w:ascii="Times New Roman" w:hAnsi="Times New Roman"/>
+          <w:sz w:val="28"/>
+        </w:rPr>
+        <w:t>v – скорость тела, м/с.</w:t>
+      </w:r>
+    </w:p>
+    <w:p>
+      <w:pPr>
+        <w:spacing w:line="360" w:lineRule="auto" w:before="0" w:after="0"/>
+        <w:ind w:firstLine="709"/>
+        <w:jc w:val="both"/>
+      </w:pPr>
+      <w:r>
+        <w:rPr>
+          <w:rFonts w:ascii="Times New Roman" w:hAnsi="Times New Roman"/>
+          <w:sz w:val="28"/>
+        </w:rPr>
+        <w:t>Ненумерованная формула идёт просто по центру:</w:t>
+      </w:r>
+    </w:p>
+    <w:p>
+      <w:pPr>
+        <w:spacing w:line="240" w:lineRule="auto" w:before="280" w:after="280"/>
+        <w:ind w:firstLine="0"/>
+      </w:pPr>
+      <m:oMathPara>
+        <m:oMath>
+          <m:sSup>
+            <m:e>
+              <m:r>
+                <m:t>a</m:t>
+              </m:r>
+            </m:e>
+            <m:sup>
+              <m:r>
+                <m:t>2</m:t>
+              </m:r>
+            </m:sup>
+          </m:sSup>
+          <m:r>
+            <m:t>+</m:t>
+          </m:r>
+          <m:sSup>
+            <m:e>
+              <m:r>
+                <m:t>b</m:t>
+              </m:r>
+            </m:e>
+            <m:sup>
+              <m:r>
+                <m:t>2</m:t>
+              </m:r>
+            </m:sup>
+          </m:sSup>
+          <m:r>
+            <m:t>=</m:t>
+          </m:r>
+          <m:sSup>
+            <m:e>
+              <m:r>
+                <m:t>c</m:t>
+              </m:r>
+            </m:e>
+            <m:sup>
+              <m:r>
+                <m:t>2</m:t>
+              </m:r>
+            </m:sup>
+          </m:sSup>
+        </m:oMath>
+      </m:oMathPara>
+    </w:p>
+    <w:p>
+      <w:pPr>
+        <w:spacing w:line="360" w:lineRule="auto" w:before="0" w:after="0"/>
+        <w:ind w:firstLine="709"/>
+        <w:jc w:val="both"/>
+      </w:pPr>
+      <w:r>
+        <w:rPr>
+          <w:rFonts w:ascii="Times New Roman" w:hAnsi="Times New Roman"/>
+          <w:sz w:val="28"/>
+        </w:rPr>
+        <w:t>Среднеквадратическое отклонение — вложенные радикал, дробь и сумма:</w:t>
+      </w:r>
+    </w:p>
+    <w:p>
+      <w:pPr>
+        <w:keepNext/>
+        <w:spacing w:line="240" w:lineRule="auto" w:before="280" w:after="0"/>
+        <w:ind w:firstLine="0"/>
+      </w:pPr>
+      <m:oMathPara>
+        <m:oMath>
+          <m:eqArr>
+            <m:eqArrPr>
+              <m:maxDist m:val="1"/>
+            </m:eqArrPr>
+            <m:e>
+              <m:r>
+                <m:t>σ</m:t>
+              </m:r>
+              <m:r>
+                <m:t>=</m:t>
+              </m:r>
+              <m:rad>
+                <m:radPr>
+                  <m:degHide m:val="on"/>
+                </m:radPr>
+                <m:deg/>
+                <m:e>
+                  <m:f>
+                    <m:num>
+                      <m:nary>
+                        <m:naryPr>
+                          <m:chr m:val="∑"/>
+                          <m:limLoc m:val="undOvr"/>
+                          <m:subHide m:val="off"/>
+                          <m:supHide m:val="off"/>
+                        </m:naryPr>
+                        <m:sub>
+                          <m:r>
+                            <m:t>i</m:t>
+                          </m:r>
+                          <m:r>
+                            <m:t>=</m:t>
+                          </m:r>
+                          <m:r>
+                            <m:t>1</m:t>
+                          </m:r>
+                        </m:sub>
+                        <m:sup>
+                          <m:r>
+                            <m:t>n</m:t>
+                          </m:r>
+                        </m:sup>
+                        <m:e>
+                          <m:sSup>
+                            <m:e>
+                              <m:d>
+                                <m:dPr>
+                                  <m:begChr m:val="("/>
+                                  <m:endChr m:val=")"/>
+                                </m:dPr>
+                                <m:e>
+                                  <m:sSub>
+                                    <m:e>
+                                      <m:r>
+                                        <m:t>x</m:t>
+                                      </m:r>
+                                    </m:e>
+                                    <m:sub>
+                                      <m:r>
+                                        <m:t>i</m:t>
+                                      </m:r>
+                                    </m:sub>
+                                  </m:sSub>
+                                  <m:r>
+                                    <m:t>−</m:t>
+                                  </m:r>
+                                  <m:acc>
+                                    <m:accPr>
+                                      <m:chr m:val="̅"/>
+                                    </m:accPr>
+                                    <m:e>
+                                      <m:r>
+                                        <m:t>x</m:t>
+                                      </m:r>
+                                    </m:e>
+                                  </m:acc>
+                                </m:e>
+                              </m:d>
+                            </m:e>
+                            <m:sup>
+                              <m:r>
+                                <m:t>2</m:t>
+                              </m:r>
+                            </m:sup>
+                          </m:sSup>
+                        </m:e>
+                      </m:nary>
+                    </m:num>
+                    <m:den>
+                      <m:r>
+                        <m:t>n</m:t>
+                      </m:r>
+                      <m:r>
+                        <m:t>−</m:t>
+                      </m:r>
+                      <m:r>
+                        <m:t>1</m:t>
+                      </m:r>
+                    </m:den>
+                  </m:f>
+                </m:e>
+              </m:rad>
+              <m:r>
+                <m:t xml:space="preserve"> #</m:t>
+              </m:r>
+              <m:d>
+                <m:e>
+                  <m:r>
+                    <m:rPr>
+                      <m:nor/>
+                    </m:rPr>
+                    <m:t xml:space="preserve">А.2</m:t>
+                  </m:r>
+                </m:e>
+              </m:d>
+            </m:e>
+          </m:eqArr>
+        </m:oMath>
+      </m:oMathPara>
+    </w:p>
+    <w:p>
+      <w:pPr>
+        <w:spacing w:line="360" w:lineRule="auto" w:before="0" w:after="0"/>
+        <w:ind w:firstLine="0"/>
+        <w:jc w:val="both"/>
+      </w:pPr>
+      <w:r>
+        <w:rPr>
+          <w:rFonts w:ascii="Times New Roman" w:hAnsi="Times New Roman"/>
+          <w:sz w:val="28"/>
+        </w:rPr>
+        <w:t xml:space="preserve">где </w:t>
+      </w:r>
+      <w:r>
+        <w:rPr>
+          <w:rFonts w:ascii="Times New Roman" w:hAnsi="Times New Roman"/>
+          <w:i/>
+          <w:sz w:val="28"/>
+        </w:rPr>
+        <w:t>x</w:t>
+      </w:r>
+      <w:r>
+        <w:rPr>
+          <w:rFonts w:ascii="Times New Roman" w:hAnsi="Times New Roman"/>
+          <w:sz w:val="28"/>
+        </w:rPr>
+        <w:t xml:space="preserve"> – значение отдельного измерения;</w:t>
+      </w:r>
+    </w:p>
+    <w:p>
+      <w:pPr>
+        <w:spacing w:line="360" w:lineRule="auto" w:before="0" w:after="0"/>
+        <w:ind w:firstLine="0"/>
+        <w:jc w:val="both"/>
+      </w:pPr>
+      <w:r>
+        <w:rPr>
+          <w:rFonts w:ascii="Times New Roman" w:hAnsi="Times New Roman"/>
+          <w:sz w:val="28"/>
+        </w:rPr>
+        <w:t>n – объём выборки.</w:t>
+      </w:r>
+    </w:p>
+    <w:p>
+      <w:pPr>
+        <w:spacing w:line="360" w:lineRule="auto" w:before="0" w:after="0"/>
+        <w:ind w:firstLine="709"/>
+        <w:jc w:val="both"/>
+      </w:pPr>
+      <w:r>
+        <w:rPr>
+          <w:rFonts w:ascii="Times New Roman" w:hAnsi="Times New Roman"/>
+          <w:sz w:val="28"/>
+        </w:rPr>
+        <w:t>Матрица, система уравнений и индексы кириллицей:</w:t>
+      </w:r>
+    </w:p>
+    <w:p>
+      <w:pPr>
+        <w:spacing w:line="240" w:lineRule="auto" w:before="280" w:after="280"/>
+        <w:ind w:firstLine="0"/>
+      </w:pPr>
+      <m:oMathPara>
+        <m:oMath>
+          <m:eqArr>
+            <m:eqArrPr>
+              <m:maxDist m:val="1"/>
+            </m:eqArrPr>
+            <m:e>
+              <m:r>
+                <m:t>A</m:t>
+              </m:r>
+              <m:r>
+                <m:t>=</m:t>
+              </m:r>
+              <m:d>
+                <m:dPr>
+                  <m:begChr m:val="("/>
+                  <m:endChr m:val=")"/>
+                </m:dPr>
+                <m:e>
+                  <m:m>
+                    <m:mr>
+                      <m:e>
+                        <m:sSub>
+                          <m:e>
+                            <m:r>
+                              <m:t>a</m:t>
+                            </m:r>
+                          </m:e>
+                          <m:sub>
+                            <m:r>
+                              <m:t>11</m:t>
+                            </m:r>
+                          </m:sub>
+                        </m:sSub>
+                      </m:e>
+                      <m:e>
+                        <m:sSub>
+                          <m:e>
+                            <m:r>
+                              <m:t>a</m:t>
+                            </m:r>
+                          </m:e>
+                          <m:sub>
+                            <m:r>
+                              <m:t>12</m:t>
+                            </m:r>
+                          </m:sub>
+                        </m:sSub>
+                      </m:e>
+                    </m:mr>
+                    <m:mr>
+                      <m:e>
+                        <m:sSub>
+                          <m:e>
+                            <m:r>
+                              <m:t>a</m:t>
+                            </m:r>
+                          </m:e>
+                          <m:sub>
+                            <m:r>
+                              <m:t>21</m:t>
+                            </m:r>
+                          </m:sub>
+                        </m:sSub>
+                      </m:e>
+                      <m:e>
+                        <m:sSub>
+                          <m:e>
+                            <m:r>
+                              <m:t>a</m:t>
+                            </m:r>
+                          </m:e>
+                          <m:sub>
+                            <m:r>
+                              <m:t>22</m:t>
+                            </m:r>
+                          </m:sub>
+                        </m:sSub>
+                      </m:e>
+                    </m:mr>
+                  </m:m>
+                </m:e>
+              </m:d>
+              <m:r>
+                <m:t xml:space="preserve"> #</m:t>
+              </m:r>
+              <m:d>
+                <m:e>
+                  <m:r>
+                    <m:rPr>
+                      <m:nor/>
+                    </m:rPr>
+                    <m:t xml:space="preserve">А.3</m:t>
+                  </m:r>
+                </m:e>
+              </m:d>
+            </m:e>
+          </m:eqArr>
+        </m:oMath>
+      </m:oMathPara>
+    </w:p>
+    <w:p>
+      <w:pPr>
+        <w:spacing w:line="240" w:lineRule="auto" w:before="280" w:after="280"/>
+        <w:ind w:firstLine="0"/>
+      </w:pPr>
+      <m:oMathPara>
+        <m:oMath>
+          <m:eqArr>
+            <m:eqArrPr>
+              <m:maxDist m:val="1"/>
+            </m:eqArrPr>
+            <m:e>
+              <m:r>
+                <m:t>f</m:t>
+              </m:r>
+              <m:d>
+                <m:dPr>
+                  <m:begChr m:val="("/>
+                  <m:endChr m:val=")"/>
+                </m:dPr>
+                <m:e>
+                  <m:r>
+                    <m:t>x</m:t>
+                  </m:r>
+                </m:e>
+              </m:d>
+              <m:r>
+                <m:t>=</m:t>
+              </m:r>
+              <m:d>
+                <m:dPr>
+                  <m:begChr m:val="{"/>
+                  <m:endChr m:val=""/>
+                </m:dPr>
+                <m:e>
+                  <m:m>
+                    <m:mPr>
+                      <m:mcs>
+                        <m:mc>
+                          <m:mcPr>
+                            <m:count m:val="2"/>
+                            <m:mcJc m:val="left"/>
+                          </m:mcPr>
+                        </m:mc>
+                      </m:mcs>
+                    </m:mPr>
+                    <m:mr>
+                      <m:e>
+                        <m:r>
+                          <m:t>x</m:t>
+                        </m:r>
+                        <m:r>
+                          <m:t>,</m:t>
+                        </m:r>
+                      </m:e>
+                      <m:e>
+                        <m:r>
+                          <m:t>x</m:t>
+                        </m:r>
+                        <m:r>
+                          <m:t>&gt;</m:t>
+                        </m:r>
+                        <m:r>
+                          <m:t>0</m:t>
+                        </m:r>
+                      </m:e>
+                    </m:mr>
+                    <m:mr>
+                      <m:e>
+                        <m:r>
+                          <m:t>0</m:t>
+                        </m:r>
+                        <m:r>
+                          <m:t>,</m:t>
+                        </m:r>
+                      </m:e>
+                      <m:e>
+                        <m:r>
+                          <m:t>x</m:t>
+                        </m:r>
+                        <m:r>
+                          <m:t>≤</m:t>
+                        </m:r>
+                        <m:r>
+                          <m:t>0</m:t>
+                        </m:r>
+                      </m:e>
+                    </m:mr>
+                  </m:m>
+                </m:e>
+              </m:d>
+              <m:r>
+                <m:t xml:space="preserve"> #</m:t>
+              </m:r>
+              <m:d>
+                <m:e>
+                  <m:r>
+                    <m:rPr>
+                      <m:nor/>
+                    </m:rPr>
+                    <m:t xml:space="preserve">А.4</m:t>
+                  </m:r>
+                </m:e>
+              </m:d>
+            </m:e>
+          </m:eqArr>
+        </m:oMath>
+      </m:oMathPara>
+    </w:p>
+    <w:p>
+      <w:pPr>
+        <w:spacing w:line="240" w:lineRule="auto" w:before="280" w:after="280"/>
+        <w:ind w:firstLine="0"/>
+      </w:pPr>
+      <m:oMathPara>
+        <m:oMath>
+          <m:eqArr>
+            <m:eqArrPr>
+              <m:maxDist m:val="1"/>
+            </m:eqArrPr>
+            <m:e>
+              <m:sSub>
+                <m:e>
+                  <m:r>
+                    <m:t>K</m:t>
+                  </m:r>
+                </m:e>
+                <m:sub>
+                  <m:r>
+                    <m:rPr>
+                      <m:nor/>
+                    </m:rPr>
+                    <m:t>сум</m:t>
+                  </m:r>
+                </m:sub>
+              </m:sSub>
+              <m:r>
+                <m:t>=</m:t>
+              </m:r>
+              <m:f>
+                <m:num>
+                  <m:sSub>
+                    <m:e>
+                      <m:r>
+                        <m:t>P</m:t>
+                      </m:r>
+                    </m:e>
+                    <m:sub>
+                      <m:r>
+                        <m:t>в</m:t>
+                      </m:r>
+                      <m:r>
+                        <m:t>х</m:t>
+                      </m:r>
+                    </m:sub>
+                  </m:sSub>
+                </m:num>
+                <m:den>
+                  <m:sSub>
+                    <m:e>
+                      <m:r>
+                        <m:t>P</m:t>
+                      </m:r>
+                    </m:e>
+                    <m:sub>
+                      <m:r>
+                        <m:t>в</m:t>
+                      </m:r>
+                      <m:r>
+                        <m:t>ы</m:t>
+                      </m:r>
+                      <m:r>
+                        <m:t>х</m:t>
+                      </m:r>
+                    </m:sub>
+                  </m:sSub>
+                </m:den>
+              </m:f>
+              <m:r>
+                <m:t>·</m:t>
+              </m:r>
+              <m:r>
+                <m:t>100</m:t>
+              </m:r>
+              <m:r>
+                <m:t>%</m:t>
+              </m:r>
+              <m:r>
+                <m:t xml:space="preserve"> #</m:t>
+              </m:r>
+              <m:d>
+                <m:e>
+                  <m:r>
+                    <m:rPr>
+                      <m:nor/>
+                    </m:rPr>
+                    <m:t xml:space="preserve">А.5</m:t>
+                  </m:r>
+                </m:e>
+              </m:d>
+            </m:e>
+          </m:eqArr>
+        </m:oMath>
+      </m:oMathPara>
+    </w:p>
     <w:p>
       <w:pPr>
         <w:sectPr>

</xml_diff>

<commit_message>
refactor: styles and example
</commit_message>
<xml_diff>
--- a/examples/example.docx
+++ b/examples/example.docx
@@ -117,13 +117,6 @@
         <w:ind w:firstLine="709"/>
         <w:jc w:val="both"/>
       </w:pPr>
-    </w:p>
-    <w:p>
-      <w:pPr>
-        <w:spacing w:line="360" w:lineRule="auto" w:before="0" w:after="0"/>
-        <w:ind w:firstLine="709"/>
-        <w:jc w:val="both"/>
-      </w:pPr>
       <w:r>
         <w:rPr>
           <w:rFonts w:ascii="Times New Roman" w:hAnsi="Times New Roman"/>
@@ -219,7 +212,7 @@
           <w:rFonts w:ascii="Times New Roman" w:hAnsi="Times New Roman"/>
           <w:sz w:val="28"/>
         </w:rPr>
-        <w:t>На рисунке А.1.</w:t>
+        <w:t>Тут демонстрируется пример ссылки на рисунок А.1. Также можно ссылаться на таблицы и формулы.</w:t>
       </w:r>
     </w:p>
     <w:p>
@@ -265,7 +258,7 @@
     </w:p>
     <w:p>
       <w:pPr>
-        <w:spacing w:line="240" w:lineRule="auto" w:after="120"/>
+        <w:spacing w:line="240" w:lineRule="auto" w:before="0" w:after="240"/>
         <w:ind w:firstLine="0"/>
         <w:jc w:val="center"/>
       </w:pPr>
@@ -294,365 +287,22 @@
     </w:p>
     <w:p>
       <w:pPr>
-        <w:keepNext/>
-        <w:spacing w:line="240" w:lineRule="auto" w:after="120"/>
-        <w:ind w:firstLine="0"/>
-        <w:jc w:val="left"/>
+        <w:spacing w:line="360" w:lineRule="auto" w:before="0" w:after="0"/>
+        <w:ind w:firstLine="709"/>
+        <w:jc w:val="both"/>
       </w:pPr>
       <w:r>
         <w:rPr>
           <w:rFonts w:ascii="Times New Roman" w:hAnsi="Times New Roman"/>
           <w:sz w:val="28"/>
         </w:rPr>
-        <w:t>Таблица А.1 – Таблица по умолчанию: со столбцом «№ п/п» и строкой номеров столбцов</w:t>
+        <w:t>На таблице А.1 можно увидеть пример таблицы по умолчанию: автоматически добавляется нумерация столбцов и строк, после нумерации строк идет двойная линия.</w:t>
       </w:r>
     </w:p>
-    <w:tbl>
-      <w:tblPr>
-        <w:tblStyle w:val="TableGrid"/>
-        <w:tblW w:type="auto" w:w="0"/>
-        <w:jc w:val="center"/>
-        <w:tblLayout w:type="fixed"/>
-        <w:tblLook w:firstColumn="1" w:firstRow="1" w:lastColumn="0" w:lastRow="0" w:noHBand="0" w:noVBand="1" w:val="04A0"/>
-      </w:tblPr>
-      <w:tblGrid>
-        <w:gridCol w:w="680"/>
-        <w:gridCol w:w="3003"/>
-        <w:gridCol w:w="3003"/>
-        <w:gridCol w:w="3003"/>
-      </w:tblGrid>
-      <w:tr>
-        <w:trPr>
-          <w:cantSplit/>
-          <w:tblHeader/>
-        </w:trPr>
-        <w:tc>
-          <w:tcPr>
-            <w:tcW w:type="dxa" w:w="680"/>
-            <w:vAlign w:val="center"/>
-          </w:tcPr>
-          <w:p>
-            <w:pPr>
-              <w:pStyle w:val="TableText"/>
-              <w:keepNext/>
-            </w:pPr>
-            <w:r>
-              <w:t>№ п/п</w:t>
-            </w:r>
-          </w:p>
-        </w:tc>
-        <w:tc>
-          <w:tcPr>
-            <w:tcW w:type="dxa" w:w="3003"/>
-            <w:vAlign w:val="center"/>
-          </w:tcPr>
-          <w:p>
-            <w:pPr>
-              <w:pStyle w:val="TableText"/>
-              <w:keepNext/>
-            </w:pPr>
-            <w:r>
-              <w:t>Показатель А</w:t>
-            </w:r>
-          </w:p>
-        </w:tc>
-        <w:tc>
-          <w:tcPr>
-            <w:tcW w:type="dxa" w:w="3003"/>
-            <w:vAlign w:val="center"/>
-          </w:tcPr>
-          <w:p>
-            <w:pPr>
-              <w:pStyle w:val="TableText"/>
-              <w:keepNext/>
-            </w:pPr>
-            <w:r>
-              <w:t>Показатель Б</w:t>
-            </w:r>
-          </w:p>
-        </w:tc>
-        <w:tc>
-          <w:tcPr>
-            <w:tcW w:type="dxa" w:w="3003"/>
-            <w:vAlign w:val="center"/>
-          </w:tcPr>
-          <w:p>
-            <w:pPr>
-              <w:pStyle w:val="TableText"/>
-              <w:keepNext/>
-            </w:pPr>
-            <w:r>
-              <w:t>Текст</w:t>
-            </w:r>
-          </w:p>
-        </w:tc>
-      </w:tr>
-      <w:tr>
-        <w:trPr>
-          <w:cantSplit/>
-          <w:tblHeader/>
-        </w:trPr>
-        <w:tc>
-          <w:tcPr>
-            <w:tcW w:type="dxa" w:w="680"/>
-            <w:tcBorders>
-              <w:bottom w:val="double" w:sz="4" w:space="0" w:color="auto"/>
-            </w:tcBorders>
-            <w:vAlign w:val="center"/>
-          </w:tcPr>
-          <w:p>
-            <w:pPr>
-              <w:pStyle w:val="TableText"/>
-              <w:keepNext/>
-            </w:pPr>
-            <w:r>
-              <w:t>1</w:t>
-            </w:r>
-          </w:p>
-        </w:tc>
-        <w:tc>
-          <w:tcPr>
-            <w:tcW w:type="dxa" w:w="3003"/>
-            <w:tcBorders>
-              <w:bottom w:val="double" w:sz="4" w:space="0" w:color="auto"/>
-            </w:tcBorders>
-            <w:vAlign w:val="center"/>
-          </w:tcPr>
-          <w:p>
-            <w:pPr>
-              <w:pStyle w:val="TableText"/>
-              <w:keepNext/>
-            </w:pPr>
-            <w:r>
-              <w:t>2</w:t>
-            </w:r>
-          </w:p>
-        </w:tc>
-        <w:tc>
-          <w:tcPr>
-            <w:tcW w:type="dxa" w:w="3003"/>
-            <w:tcBorders>
-              <w:bottom w:val="double" w:sz="4" w:space="0" w:color="auto"/>
-            </w:tcBorders>
-            <w:vAlign w:val="center"/>
-          </w:tcPr>
-          <w:p>
-            <w:pPr>
-              <w:pStyle w:val="TableText"/>
-              <w:keepNext/>
-            </w:pPr>
-            <w:r>
-              <w:t>3</w:t>
-            </w:r>
-          </w:p>
-        </w:tc>
-        <w:tc>
-          <w:tcPr>
-            <w:tcW w:type="dxa" w:w="3003"/>
-            <w:tcBorders>
-              <w:bottom w:val="double" w:sz="4" w:space="0" w:color="auto"/>
-            </w:tcBorders>
-            <w:vAlign w:val="center"/>
-          </w:tcPr>
-          <w:p>
-            <w:pPr>
-              <w:pStyle w:val="TableText"/>
-              <w:keepNext/>
-            </w:pPr>
-            <w:r>
-              <w:t>4</w:t>
-            </w:r>
-          </w:p>
-        </w:tc>
-      </w:tr>
-      <w:tr>
-        <w:trPr>
-          <w:cantSplit/>
-        </w:trPr>
-        <w:tc>
-          <w:tcPr>
-            <w:tcW w:type="dxa" w:w="680"/>
-            <w:vAlign w:val="center"/>
-          </w:tcPr>
-          <w:p>
-            <w:pPr>
-              <w:pStyle w:val="TableText"/>
-            </w:pPr>
-            <w:r>
-              <w:t>1</w:t>
-            </w:r>
-          </w:p>
-        </w:tc>
-        <w:tc>
-          <w:tcPr>
-            <w:tcW w:type="dxa" w:w="3003"/>
-            <w:vAlign w:val="center"/>
-          </w:tcPr>
-          <w:p>
-            <w:pPr>
-              <w:pStyle w:val="TableText"/>
-            </w:pPr>
-            <w:r>
-              <w:t>1.00</w:t>
-            </w:r>
-          </w:p>
-        </w:tc>
-        <w:tc>
-          <w:tcPr>
-            <w:tcW w:type="dxa" w:w="3003"/>
-            <w:vAlign w:val="center"/>
-          </w:tcPr>
-          <w:p>
-            <w:pPr>
-              <w:pStyle w:val="TableText"/>
-            </w:pPr>
-            <w:r>
-              <w:t>100.00</w:t>
-            </w:r>
-          </w:p>
-        </w:tc>
-        <w:tc>
-          <w:tcPr>
-            <w:tcW w:type="dxa" w:w="3003"/>
-            <w:vAlign w:val="center"/>
-          </w:tcPr>
-          <w:p>
-            <w:pPr>
-              <w:pStyle w:val="TableText"/>
-            </w:pPr>
-            <w:r>
-              <w:t>alpha</w:t>
-            </w:r>
-          </w:p>
-        </w:tc>
-      </w:tr>
-      <w:tr>
-        <w:trPr>
-          <w:cantSplit/>
-        </w:trPr>
-        <w:tc>
-          <w:tcPr>
-            <w:tcW w:type="dxa" w:w="680"/>
-            <w:vAlign w:val="center"/>
-          </w:tcPr>
-          <w:p>
-            <w:pPr>
-              <w:pStyle w:val="TableText"/>
-            </w:pPr>
-            <w:r>
-              <w:t>2</w:t>
-            </w:r>
-          </w:p>
-        </w:tc>
-        <w:tc>
-          <w:tcPr>
-            <w:tcW w:type="dxa" w:w="3003"/>
-            <w:vAlign w:val="center"/>
-          </w:tcPr>
-          <w:p>
-            <w:pPr>
-              <w:pStyle w:val="TableText"/>
-            </w:pPr>
-            <w:r>
-              <w:t>2.50</w:t>
-            </w:r>
-          </w:p>
-        </w:tc>
-        <w:tc>
-          <w:tcPr>
-            <w:tcW w:type="dxa" w:w="3003"/>
-            <w:vAlign w:val="center"/>
-          </w:tcPr>
-          <w:p>
-            <w:pPr>
-              <w:pStyle w:val="TableText"/>
-            </w:pPr>
-            <w:r>
-              <w:t>200.00</w:t>
-            </w:r>
-          </w:p>
-        </w:tc>
-        <w:tc>
-          <w:tcPr>
-            <w:tcW w:type="dxa" w:w="3003"/>
-            <w:vAlign w:val="center"/>
-          </w:tcPr>
-          <w:p>
-            <w:pPr>
-              <w:pStyle w:val="TableText"/>
-            </w:pPr>
-            <w:r>
-              <w:t>beta</w:t>
-            </w:r>
-          </w:p>
-        </w:tc>
-      </w:tr>
-      <w:tr>
-        <w:trPr>
-          <w:cantSplit/>
-        </w:trPr>
-        <w:tc>
-          <w:tcPr>
-            <w:tcW w:type="dxa" w:w="680"/>
-            <w:vAlign w:val="center"/>
-          </w:tcPr>
-          <w:p>
-            <w:pPr>
-              <w:pStyle w:val="TableText"/>
-            </w:pPr>
-            <w:r>
-              <w:t>3</w:t>
-            </w:r>
-          </w:p>
-        </w:tc>
-        <w:tc>
-          <w:tcPr>
-            <w:tcW w:type="dxa" w:w="3003"/>
-            <w:vAlign w:val="center"/>
-          </w:tcPr>
-          <w:p>
-            <w:pPr>
-              <w:pStyle w:val="TableText"/>
-            </w:pPr>
-            <w:r>
-              <w:t>3.33</w:t>
-            </w:r>
-          </w:p>
-        </w:tc>
-        <w:tc>
-          <w:tcPr>
-            <w:tcW w:type="dxa" w:w="3003"/>
-            <w:vAlign w:val="center"/>
-          </w:tcPr>
-          <w:p>
-            <w:pPr>
-              <w:pStyle w:val="TableText"/>
-            </w:pPr>
-            <w:r>
-              <w:t>300.00</w:t>
-            </w:r>
-          </w:p>
-        </w:tc>
-        <w:tc>
-          <w:tcPr>
-            <w:tcW w:type="dxa" w:w="3003"/>
-            <w:vAlign w:val="center"/>
-          </w:tcPr>
-          <w:p>
-            <w:pPr>
-              <w:pStyle w:val="TableText"/>
-            </w:pPr>
-            <w:r>
-              <w:t>gamma</w:t>
-            </w:r>
-          </w:p>
-        </w:tc>
-      </w:tr>
-    </w:tbl>
     <w:p>
       <w:pPr>
         <w:keepNext/>
-        <w:spacing w:line="240" w:lineRule="auto" w:after="120"/>
+        <w:spacing w:line="240" w:lineRule="auto" w:before="0" w:after="0"/>
         <w:ind w:firstLine="0"/>
         <w:jc w:val="left"/>
       </w:pPr>
@@ -852,7 +502,7 @@
     <w:p>
       <w:pPr>
         <w:keepNext/>
-        <w:spacing w:line="240" w:lineRule="auto" w:after="120"/>
+        <w:spacing w:line="240" w:lineRule="auto" w:before="0" w:after="0"/>
         <w:ind w:firstLine="0"/>
         <w:jc w:val="left"/>
       </w:pPr>
@@ -1035,7 +685,7 @@
     <w:p>
       <w:pPr>
         <w:keepNext/>
-        <w:spacing w:line="240" w:lineRule="auto" w:after="120"/>
+        <w:spacing w:line="240" w:lineRule="auto" w:before="0" w:after="0"/>
         <w:ind w:firstLine="0"/>
         <w:jc w:val="left"/>
       </w:pPr>
@@ -1269,7 +919,7 @@
     <w:p>
       <w:pPr>
         <w:keepNext/>
-        <w:spacing w:line="240" w:lineRule="auto" w:after="120"/>
+        <w:spacing w:line="240" w:lineRule="auto" w:before="0" w:after="0"/>
         <w:ind w:firstLine="0"/>
         <w:jc w:val="left"/>
       </w:pPr>
@@ -3089,7 +2739,7 @@
       <w:pPr>
         <w:keepNext/>
         <w:pageBreakBefore/>
-        <w:spacing w:line="240" w:lineRule="auto" w:after="120"/>
+        <w:spacing w:line="240" w:lineRule="auto" w:before="0" w:after="0"/>
         <w:ind w:firstLine="0"/>
         <w:jc w:val="left"/>
       </w:pPr>
@@ -7738,7 +7388,7 @@
     <w:p>
       <w:pPr>
         <w:keepNext/>
-        <w:spacing w:line="240" w:lineRule="auto" w:after="120"/>
+        <w:spacing w:line="240" w:lineRule="auto" w:before="0" w:after="0"/>
         <w:ind w:firstLine="0"/>
         <w:jc w:val="left"/>
       </w:pPr>
@@ -7987,7 +7637,7 @@
     <w:p>
       <w:pPr>
         <w:keepNext/>
-        <w:spacing w:line="240" w:lineRule="auto" w:after="120"/>
+        <w:spacing w:line="240" w:lineRule="auto" w:before="0" w:after="0"/>
         <w:ind w:firstLine="0"/>
         <w:jc w:val="left"/>
       </w:pPr>

</xml_diff>

<commit_message>
refactor: style of heads
</commit_message>
<xml_diff>
--- a/examples/example.docx
+++ b/examples/example.docx
@@ -5,7 +5,7 @@
     <w:p>
       <w:pPr>
         <w:pStyle w:val="Heading1"/>
-        <w:spacing w:line="360" w:lineRule="auto" w:before="0" w:after="0"/>
+        <w:spacing w:line="360" w:lineRule="auto" w:before="120" w:after="120"/>
         <w:ind w:firstLine="0"/>
         <w:jc w:val="center"/>
       </w:pPr>
@@ -24,7 +24,7 @@
     <w:p>
       <w:pPr>
         <w:pStyle w:val="Heading2"/>
-        <w:spacing w:line="360" w:lineRule="auto" w:before="0" w:after="0"/>
+        <w:spacing w:line="360" w:lineRule="auto" w:before="120" w:after="120"/>
         <w:ind w:firstLine="709"/>
         <w:jc w:val="both"/>
       </w:pPr>
@@ -43,7 +43,7 @@
     <w:p>
       <w:pPr>
         <w:pStyle w:val="Heading3"/>
-        <w:spacing w:line="360" w:lineRule="auto" w:before="0" w:after="0"/>
+        <w:spacing w:line="360" w:lineRule="auto" w:before="120" w:after="120"/>
         <w:ind w:firstLine="709"/>
         <w:jc w:val="both"/>
       </w:pPr>
@@ -6628,7 +6628,7 @@
     <w:p>
       <w:pPr>
         <w:pStyle w:val="Heading1"/>
-        <w:spacing w:line="360" w:lineRule="auto" w:before="0" w:after="0"/>
+        <w:spacing w:line="360" w:lineRule="auto" w:before="120" w:after="120"/>
         <w:ind w:firstLine="0"/>
         <w:jc w:val="center"/>
       </w:pPr>
@@ -7374,7 +7374,7 @@
     <w:p>
       <w:pPr>
         <w:pStyle w:val="Heading1"/>
-        <w:spacing w:line="360" w:lineRule="auto" w:before="0" w:after="0"/>
+        <w:spacing w:line="360" w:lineRule="auto" w:before="120" w:after="120"/>
         <w:ind w:firstLine="0"/>
         <w:jc w:val="center"/>
       </w:pPr>
@@ -8311,7 +8311,7 @@
     <w:pPr>
       <w:keepNext/>
       <w:keepLines/>
-      <w:spacing w:before="0" w:after="0" w:line="360" w:lineRule="auto"/>
+      <w:spacing w:before="120" w:after="120" w:line="360" w:lineRule="auto"/>
       <w:ind w:firstLine="0"/>
       <w:jc w:val="center"/>
       <w:outlineLvl w:val="0"/>
@@ -8339,7 +8339,7 @@
     <w:pPr>
       <w:keepNext/>
       <w:keepLines/>
-      <w:spacing w:before="0" w:after="0" w:line="360" w:lineRule="auto"/>
+      <w:spacing w:before="120" w:after="120" w:line="360" w:lineRule="auto"/>
       <w:ind w:firstLine="709"/>
       <w:jc w:val="both"/>
       <w:outlineLvl w:val="1"/>
@@ -8367,7 +8367,7 @@
     <w:pPr>
       <w:keepNext/>
       <w:keepLines/>
-      <w:spacing w:before="0" w:after="0" w:line="360" w:lineRule="auto"/>
+      <w:spacing w:before="120" w:after="120" w:line="360" w:lineRule="auto"/>
       <w:ind w:firstLine="709"/>
       <w:jc w:val="both"/>
       <w:outlineLvl w:val="2"/>

</xml_diff>

<commit_message>
Create pretty docs and README
</commit_message>
<xml_diff>
--- a/examples/example.docx
+++ b/examples/example.docx
@@ -5,7 +5,7 @@
     <w:p>
       <w:pPr>
         <w:pStyle w:val="Heading1"/>
-        <w:spacing w:line="360" w:lineRule="auto" w:before="0" w:after="0"/>
+        <w:spacing w:line="360" w:lineRule="auto" w:before="120" w:after="120"/>
         <w:ind w:firstLine="0"/>
         <w:jc w:val="center"/>
       </w:pPr>
@@ -24,7 +24,7 @@
     <w:p>
       <w:pPr>
         <w:pStyle w:val="Heading2"/>
-        <w:spacing w:line="360" w:lineRule="auto" w:before="0" w:after="0"/>
+        <w:spacing w:line="360" w:lineRule="auto" w:before="120" w:after="120"/>
         <w:ind w:firstLine="709"/>
         <w:jc w:val="both"/>
       </w:pPr>
@@ -43,7 +43,7 @@
     <w:p>
       <w:pPr>
         <w:pStyle w:val="Heading3"/>
-        <w:spacing w:line="360" w:lineRule="auto" w:before="0" w:after="0"/>
+        <w:spacing w:line="360" w:lineRule="auto" w:before="120" w:after="120"/>
         <w:ind w:firstLine="709"/>
         <w:jc w:val="both"/>
       </w:pPr>
@@ -110,13 +110,6 @@
         </w:rPr>
         <w:t xml:space="preserve">Обычный абзац: Times New Roman 14pt, выравнивание по ширине, межстрочный интервал 1,5, красная строка 1,25 см. Длинный текст нужен, чтобы проверить выравнивание по ширине на нескольких строках — вот ещё немного слов для этого. </w:t>
       </w:r>
-    </w:p>
-    <w:p>
-      <w:pPr>
-        <w:spacing w:line="360" w:lineRule="auto" w:before="0" w:after="0"/>
-        <w:ind w:firstLine="709"/>
-        <w:jc w:val="both"/>
-      </w:pPr>
     </w:p>
     <w:p>
       <w:pPr>
@@ -219,7 +212,7 @@
           <w:rFonts w:ascii="Times New Roman" w:hAnsi="Times New Roman"/>
           <w:sz w:val="28"/>
         </w:rPr>
-        <w:t>На рисунке А.1.</w:t>
+        <w:t>Тут демонстрируется пример ссылки на рисунок А.1. Также можно ссылаться на таблицы и формулы.</w:t>
       </w:r>
     </w:p>
     <w:p>
@@ -265,7 +258,7 @@
     </w:p>
     <w:p>
       <w:pPr>
-        <w:spacing w:line="240" w:lineRule="auto" w:after="120"/>
+        <w:spacing w:line="240" w:lineRule="auto" w:before="0" w:after="240"/>
         <w:ind w:firstLine="0"/>
         <w:jc w:val="center"/>
       </w:pPr>
@@ -294,365 +287,22 @@
     </w:p>
     <w:p>
       <w:pPr>
-        <w:keepNext/>
-        <w:spacing w:line="240" w:lineRule="auto" w:after="120"/>
-        <w:ind w:firstLine="0"/>
-        <w:jc w:val="left"/>
+        <w:spacing w:line="360" w:lineRule="auto" w:before="0" w:after="0"/>
+        <w:ind w:firstLine="709"/>
+        <w:jc w:val="both"/>
       </w:pPr>
       <w:r>
         <w:rPr>
           <w:rFonts w:ascii="Times New Roman" w:hAnsi="Times New Roman"/>
           <w:sz w:val="28"/>
         </w:rPr>
-        <w:t>Таблица А.1 – Таблица по умолчанию: со столбцом «№ п/п» и строкой номеров столбцов</w:t>
+        <w:t>На таблице А.1 можно увидеть пример таблицы по умолчанию: автоматически добавляется нумерация столбцов и строк, после нумерации строк идет двойная линия.</w:t>
       </w:r>
     </w:p>
-    <w:tbl>
-      <w:tblPr>
-        <w:tblStyle w:val="TableGrid"/>
-        <w:tblW w:type="auto" w:w="0"/>
-        <w:jc w:val="center"/>
-        <w:tblLayout w:type="fixed"/>
-        <w:tblLook w:firstColumn="1" w:firstRow="1" w:lastColumn="0" w:lastRow="0" w:noHBand="0" w:noVBand="1" w:val="04A0"/>
-      </w:tblPr>
-      <w:tblGrid>
-        <w:gridCol w:w="680"/>
-        <w:gridCol w:w="3003"/>
-        <w:gridCol w:w="3003"/>
-        <w:gridCol w:w="3003"/>
-      </w:tblGrid>
-      <w:tr>
-        <w:trPr>
-          <w:cantSplit/>
-          <w:tblHeader/>
-        </w:trPr>
-        <w:tc>
-          <w:tcPr>
-            <w:tcW w:type="dxa" w:w="680"/>
-            <w:vAlign w:val="center"/>
-          </w:tcPr>
-          <w:p>
-            <w:pPr>
-              <w:pStyle w:val="TableText"/>
-              <w:keepNext/>
-            </w:pPr>
-            <w:r>
-              <w:t>№ п/п</w:t>
-            </w:r>
-          </w:p>
-        </w:tc>
-        <w:tc>
-          <w:tcPr>
-            <w:tcW w:type="dxa" w:w="3003"/>
-            <w:vAlign w:val="center"/>
-          </w:tcPr>
-          <w:p>
-            <w:pPr>
-              <w:pStyle w:val="TableText"/>
-              <w:keepNext/>
-            </w:pPr>
-            <w:r>
-              <w:t>Показатель А</w:t>
-            </w:r>
-          </w:p>
-        </w:tc>
-        <w:tc>
-          <w:tcPr>
-            <w:tcW w:type="dxa" w:w="3003"/>
-            <w:vAlign w:val="center"/>
-          </w:tcPr>
-          <w:p>
-            <w:pPr>
-              <w:pStyle w:val="TableText"/>
-              <w:keepNext/>
-            </w:pPr>
-            <w:r>
-              <w:t>Показатель Б</w:t>
-            </w:r>
-          </w:p>
-        </w:tc>
-        <w:tc>
-          <w:tcPr>
-            <w:tcW w:type="dxa" w:w="3003"/>
-            <w:vAlign w:val="center"/>
-          </w:tcPr>
-          <w:p>
-            <w:pPr>
-              <w:pStyle w:val="TableText"/>
-              <w:keepNext/>
-            </w:pPr>
-            <w:r>
-              <w:t>Текст</w:t>
-            </w:r>
-          </w:p>
-        </w:tc>
-      </w:tr>
-      <w:tr>
-        <w:trPr>
-          <w:cantSplit/>
-          <w:tblHeader/>
-        </w:trPr>
-        <w:tc>
-          <w:tcPr>
-            <w:tcW w:type="dxa" w:w="680"/>
-            <w:tcBorders>
-              <w:bottom w:val="double" w:sz="4" w:space="0" w:color="auto"/>
-            </w:tcBorders>
-            <w:vAlign w:val="center"/>
-          </w:tcPr>
-          <w:p>
-            <w:pPr>
-              <w:pStyle w:val="TableText"/>
-              <w:keepNext/>
-            </w:pPr>
-            <w:r>
-              <w:t>1</w:t>
-            </w:r>
-          </w:p>
-        </w:tc>
-        <w:tc>
-          <w:tcPr>
-            <w:tcW w:type="dxa" w:w="3003"/>
-            <w:tcBorders>
-              <w:bottom w:val="double" w:sz="4" w:space="0" w:color="auto"/>
-            </w:tcBorders>
-            <w:vAlign w:val="center"/>
-          </w:tcPr>
-          <w:p>
-            <w:pPr>
-              <w:pStyle w:val="TableText"/>
-              <w:keepNext/>
-            </w:pPr>
-            <w:r>
-              <w:t>2</w:t>
-            </w:r>
-          </w:p>
-        </w:tc>
-        <w:tc>
-          <w:tcPr>
-            <w:tcW w:type="dxa" w:w="3003"/>
-            <w:tcBorders>
-              <w:bottom w:val="double" w:sz="4" w:space="0" w:color="auto"/>
-            </w:tcBorders>
-            <w:vAlign w:val="center"/>
-          </w:tcPr>
-          <w:p>
-            <w:pPr>
-              <w:pStyle w:val="TableText"/>
-              <w:keepNext/>
-            </w:pPr>
-            <w:r>
-              <w:t>3</w:t>
-            </w:r>
-          </w:p>
-        </w:tc>
-        <w:tc>
-          <w:tcPr>
-            <w:tcW w:type="dxa" w:w="3003"/>
-            <w:tcBorders>
-              <w:bottom w:val="double" w:sz="4" w:space="0" w:color="auto"/>
-            </w:tcBorders>
-            <w:vAlign w:val="center"/>
-          </w:tcPr>
-          <w:p>
-            <w:pPr>
-              <w:pStyle w:val="TableText"/>
-              <w:keepNext/>
-            </w:pPr>
-            <w:r>
-              <w:t>4</w:t>
-            </w:r>
-          </w:p>
-        </w:tc>
-      </w:tr>
-      <w:tr>
-        <w:trPr>
-          <w:cantSplit/>
-        </w:trPr>
-        <w:tc>
-          <w:tcPr>
-            <w:tcW w:type="dxa" w:w="680"/>
-            <w:vAlign w:val="center"/>
-          </w:tcPr>
-          <w:p>
-            <w:pPr>
-              <w:pStyle w:val="TableText"/>
-            </w:pPr>
-            <w:r>
-              <w:t>1</w:t>
-            </w:r>
-          </w:p>
-        </w:tc>
-        <w:tc>
-          <w:tcPr>
-            <w:tcW w:type="dxa" w:w="3003"/>
-            <w:vAlign w:val="center"/>
-          </w:tcPr>
-          <w:p>
-            <w:pPr>
-              <w:pStyle w:val="TableText"/>
-            </w:pPr>
-            <w:r>
-              <w:t>1.00</w:t>
-            </w:r>
-          </w:p>
-        </w:tc>
-        <w:tc>
-          <w:tcPr>
-            <w:tcW w:type="dxa" w:w="3003"/>
-            <w:vAlign w:val="center"/>
-          </w:tcPr>
-          <w:p>
-            <w:pPr>
-              <w:pStyle w:val="TableText"/>
-            </w:pPr>
-            <w:r>
-              <w:t>100.00</w:t>
-            </w:r>
-          </w:p>
-        </w:tc>
-        <w:tc>
-          <w:tcPr>
-            <w:tcW w:type="dxa" w:w="3003"/>
-            <w:vAlign w:val="center"/>
-          </w:tcPr>
-          <w:p>
-            <w:pPr>
-              <w:pStyle w:val="TableText"/>
-            </w:pPr>
-            <w:r>
-              <w:t>alpha</w:t>
-            </w:r>
-          </w:p>
-        </w:tc>
-      </w:tr>
-      <w:tr>
-        <w:trPr>
-          <w:cantSplit/>
-        </w:trPr>
-        <w:tc>
-          <w:tcPr>
-            <w:tcW w:type="dxa" w:w="680"/>
-            <w:vAlign w:val="center"/>
-          </w:tcPr>
-          <w:p>
-            <w:pPr>
-              <w:pStyle w:val="TableText"/>
-            </w:pPr>
-            <w:r>
-              <w:t>2</w:t>
-            </w:r>
-          </w:p>
-        </w:tc>
-        <w:tc>
-          <w:tcPr>
-            <w:tcW w:type="dxa" w:w="3003"/>
-            <w:vAlign w:val="center"/>
-          </w:tcPr>
-          <w:p>
-            <w:pPr>
-              <w:pStyle w:val="TableText"/>
-            </w:pPr>
-            <w:r>
-              <w:t>2.50</w:t>
-            </w:r>
-          </w:p>
-        </w:tc>
-        <w:tc>
-          <w:tcPr>
-            <w:tcW w:type="dxa" w:w="3003"/>
-            <w:vAlign w:val="center"/>
-          </w:tcPr>
-          <w:p>
-            <w:pPr>
-              <w:pStyle w:val="TableText"/>
-            </w:pPr>
-            <w:r>
-              <w:t>200.00</w:t>
-            </w:r>
-          </w:p>
-        </w:tc>
-        <w:tc>
-          <w:tcPr>
-            <w:tcW w:type="dxa" w:w="3003"/>
-            <w:vAlign w:val="center"/>
-          </w:tcPr>
-          <w:p>
-            <w:pPr>
-              <w:pStyle w:val="TableText"/>
-            </w:pPr>
-            <w:r>
-              <w:t>beta</w:t>
-            </w:r>
-          </w:p>
-        </w:tc>
-      </w:tr>
-      <w:tr>
-        <w:trPr>
-          <w:cantSplit/>
-        </w:trPr>
-        <w:tc>
-          <w:tcPr>
-            <w:tcW w:type="dxa" w:w="680"/>
-            <w:vAlign w:val="center"/>
-          </w:tcPr>
-          <w:p>
-            <w:pPr>
-              <w:pStyle w:val="TableText"/>
-            </w:pPr>
-            <w:r>
-              <w:t>3</w:t>
-            </w:r>
-          </w:p>
-        </w:tc>
-        <w:tc>
-          <w:tcPr>
-            <w:tcW w:type="dxa" w:w="3003"/>
-            <w:vAlign w:val="center"/>
-          </w:tcPr>
-          <w:p>
-            <w:pPr>
-              <w:pStyle w:val="TableText"/>
-            </w:pPr>
-            <w:r>
-              <w:t>3.33</w:t>
-            </w:r>
-          </w:p>
-        </w:tc>
-        <w:tc>
-          <w:tcPr>
-            <w:tcW w:type="dxa" w:w="3003"/>
-            <w:vAlign w:val="center"/>
-          </w:tcPr>
-          <w:p>
-            <w:pPr>
-              <w:pStyle w:val="TableText"/>
-            </w:pPr>
-            <w:r>
-              <w:t>300.00</w:t>
-            </w:r>
-          </w:p>
-        </w:tc>
-        <w:tc>
-          <w:tcPr>
-            <w:tcW w:type="dxa" w:w="3003"/>
-            <w:vAlign w:val="center"/>
-          </w:tcPr>
-          <w:p>
-            <w:pPr>
-              <w:pStyle w:val="TableText"/>
-            </w:pPr>
-            <w:r>
-              <w:t>gamma</w:t>
-            </w:r>
-          </w:p>
-        </w:tc>
-      </w:tr>
-    </w:tbl>
     <w:p>
       <w:pPr>
         <w:keepNext/>
-        <w:spacing w:line="240" w:lineRule="auto" w:after="120"/>
+        <w:spacing w:line="240" w:lineRule="auto" w:before="0" w:after="0"/>
         <w:ind w:firstLine="0"/>
         <w:jc w:val="left"/>
       </w:pPr>
@@ -852,7 +502,7 @@
     <w:p>
       <w:pPr>
         <w:keepNext/>
-        <w:spacing w:line="240" w:lineRule="auto" w:after="120"/>
+        <w:spacing w:line="240" w:lineRule="auto" w:before="0" w:after="0"/>
         <w:ind w:firstLine="0"/>
         <w:jc w:val="left"/>
       </w:pPr>
@@ -1035,7 +685,7 @@
     <w:p>
       <w:pPr>
         <w:keepNext/>
-        <w:spacing w:line="240" w:lineRule="auto" w:after="120"/>
+        <w:spacing w:line="240" w:lineRule="auto" w:before="0" w:after="0"/>
         <w:ind w:firstLine="0"/>
         <w:jc w:val="left"/>
       </w:pPr>
@@ -1269,7 +919,7 @@
     <w:p>
       <w:pPr>
         <w:keepNext/>
-        <w:spacing w:line="240" w:lineRule="auto" w:after="120"/>
+        <w:spacing w:line="240" w:lineRule="auto" w:before="0" w:after="0"/>
         <w:ind w:firstLine="0"/>
         <w:jc w:val="left"/>
       </w:pPr>
@@ -3089,7 +2739,7 @@
       <w:pPr>
         <w:keepNext/>
         <w:pageBreakBefore/>
-        <w:spacing w:line="240" w:lineRule="auto" w:after="120"/>
+        <w:spacing w:line="240" w:lineRule="auto" w:before="0" w:after="0"/>
         <w:ind w:firstLine="0"/>
         <w:jc w:val="left"/>
       </w:pPr>
@@ -6978,7 +6628,7 @@
     <w:p>
       <w:pPr>
         <w:pStyle w:val="Heading1"/>
-        <w:spacing w:line="360" w:lineRule="auto" w:before="0" w:after="0"/>
+        <w:spacing w:line="360" w:lineRule="auto" w:before="120" w:after="120"/>
         <w:ind w:firstLine="0"/>
         <w:jc w:val="center"/>
       </w:pPr>
@@ -7080,7 +6730,9 @@
           <w:rFonts w:ascii="Times New Roman" w:hAnsi="Times New Roman"/>
           <w:sz w:val="28"/>
         </w:rPr>
-        <w:t>где m – масса тела, кг;</w:t>
+        <w:t xml:space="preserve">где </w:t>
+        <w:tab/>
+        <w:t>m – масса тела, кг;</w:t>
       </w:r>
     </w:p>
     <w:p>
@@ -7094,6 +6746,7 @@
           <w:rFonts w:ascii="Times New Roman" w:hAnsi="Times New Roman"/>
           <w:sz w:val="28"/>
         </w:rPr>
+        <w:tab/>
         <w:t>v – скорость тела, м/с.</w:t>
       </w:r>
     </w:p>
@@ -7317,6 +6970,7 @@
           <w:sz w:val="28"/>
         </w:rPr>
         <w:t xml:space="preserve">где </w:t>
+        <w:tab/>
       </w:r>
       <w:r>
         <w:rPr>
@@ -7345,6 +6999,7 @@
           <w:rFonts w:ascii="Times New Roman" w:hAnsi="Times New Roman"/>
           <w:sz w:val="28"/>
         </w:rPr>
+        <w:tab/>
         <w:t>n – объём выборки.</w:t>
       </w:r>
     </w:p>
@@ -7719,7 +7374,7 @@
     <w:p>
       <w:pPr>
         <w:pStyle w:val="Heading1"/>
-        <w:spacing w:line="360" w:lineRule="auto" w:before="0" w:after="0"/>
+        <w:spacing w:line="360" w:lineRule="auto" w:before="120" w:after="120"/>
         <w:ind w:firstLine="0"/>
         <w:jc w:val="center"/>
       </w:pPr>
@@ -7738,7 +7393,7 @@
     <w:p>
       <w:pPr>
         <w:keepNext/>
-        <w:spacing w:line="240" w:lineRule="auto" w:after="120"/>
+        <w:spacing w:line="240" w:lineRule="auto" w:before="0" w:after="0"/>
         <w:ind w:firstLine="0"/>
         <w:jc w:val="left"/>
       </w:pPr>
@@ -7987,7 +7642,7 @@
     <w:p>
       <w:pPr>
         <w:keepNext/>
-        <w:spacing w:line="240" w:lineRule="auto" w:after="120"/>
+        <w:spacing w:line="240" w:lineRule="auto" w:before="0" w:after="0"/>
         <w:ind w:firstLine="0"/>
         <w:jc w:val="left"/>
       </w:pPr>
@@ -8656,7 +8311,7 @@
     <w:pPr>
       <w:keepNext/>
       <w:keepLines/>
-      <w:spacing w:before="0" w:after="0" w:line="360" w:lineRule="auto"/>
+      <w:spacing w:before="120" w:after="120" w:line="360" w:lineRule="auto"/>
       <w:ind w:firstLine="0"/>
       <w:jc w:val="center"/>
       <w:outlineLvl w:val="0"/>
@@ -8684,7 +8339,7 @@
     <w:pPr>
       <w:keepNext/>
       <w:keepLines/>
-      <w:spacing w:before="0" w:after="0" w:line="360" w:lineRule="auto"/>
+      <w:spacing w:before="120" w:after="120" w:line="360" w:lineRule="auto"/>
       <w:ind w:firstLine="709"/>
       <w:jc w:val="both"/>
       <w:outlineLvl w:val="1"/>
@@ -8712,7 +8367,7 @@
     <w:pPr>
       <w:keepNext/>
       <w:keepLines/>
-      <w:spacing w:before="0" w:after="0" w:line="360" w:lineRule="auto"/>
+      <w:spacing w:before="120" w:after="120" w:line="360" w:lineRule="auto"/>
       <w:ind w:firstLine="709"/>
       <w:jc w:val="both"/>
       <w:outlineLvl w:val="2"/>

</xml_diff>